<commit_message>
Wiring: expanded printable Word guide (power, modem, PlusRoc, harness)
Co-authored-by: joelevy1 <joelevy1@users.noreply.github.com>
</commit_message>
<xml_diff>
--- a/boat_monitor/WIRING_CHEAT_SHEET.docx
+++ b/boat_monitor/WIRING_CHEAT_SHEET.docx
@@ -9,9 +9,9 @@
       <w:r>
         <w:rPr>
           <w:b/>
-          <w:sz w:val="26"/>
+          <w:sz w:val="28"/>
         </w:rPr>
-        <w:t>Boat Monitor P2 — Wiring (Minimal Changes)</w:t>
+        <w:t>Boat Monitor P2 — Wiring Guide (print at bench)</w:t>
       </w:r>
     </w:p>
     <w:p>
@@ -22,7 +22,7 @@
         <w:rPr>
           <w:sz w:val="18"/>
         </w:rPr>
-        <w:t>VSNS on pin 15 (done) · No more wire moves · New connections only</w:t>
+        <w:t>HOUSE = middle INA260 · ENGINE = bottom INA260 · VSNS on Pico pin 15</w:t>
       </w:r>
     </w:p>
     <w:p>
@@ -30,7 +30,125 @@
         <w:pStyle w:val="Heading1"/>
       </w:pPr>
       <w:r>
-        <w:t>SECTION 1 — ALREADY DONE (do not change)</w:t>
+        <w:t>Policy</w:t>
+      </w:r>
+    </w:p>
+    <w:p>
+      <w:r>
+        <w:rPr>
+          <w:b w:val="0"/>
+          <w:sz w:val="18"/>
+        </w:rPr>
+        <w:t>Section 1 is already wired — do not unsolder or move those connections. Everything else below is new pigtails, modem, opto, PlusRoc, and boat harness only.</w:t>
+      </w:r>
+    </w:p>
+    <w:p>
+      <w:pPr>
+        <w:pStyle w:val="Heading1"/>
+      </w:pPr>
+      <w:r>
+        <w:t>Three power changes (summary)</w:t>
+      </w:r>
+    </w:p>
+    <w:p>
+      <w:pPr>
+        <w:pStyle w:val="ListBullet"/>
+      </w:pPr>
+      <w:r>
+        <w:rPr>
+          <w:sz w:val="18"/>
+        </w:rPr>
+        <w:t>One Voltaic V50 USB-A #1 feed only for the Pico path: V50+ → INA219 Vin+ → TPS2113A IN1 → Pico VSYS (pin 39). INA219 measures total current on that path (Pico + anything you branch from the same 5 V bus upstream of the split).</w:t>
+      </w:r>
+    </w:p>
+    <w:p>
+      <w:pPr>
+        <w:pStyle w:val="ListBullet"/>
+      </w:pPr>
+      <w:r>
+        <w:rPr>
+          <w:sz w:val="18"/>
+        </w:rPr>
+        <w:t>Remove a second V50 USB-A port dedicated only to modem power. Modem 5 V comes from the shared modem 5 V bus instead (see diodes below).</w:t>
+      </w:r>
+    </w:p>
+    <w:p>
+      <w:pPr>
+        <w:pStyle w:val="ListBullet"/>
+      </w:pPr>
+      <w:r>
+        <w:rPr>
+          <w:sz w:val="18"/>
+        </w:rPr>
+        <w:t>Modem hardware reset: SIM7600 RST → Pico physical pin 14 (GP10). Common GND with Pico and modem.</w:t>
+      </w:r>
+    </w:p>
+    <w:p>
+      <w:r>
+        <w:rPr>
+          <w:b/>
+          <w:sz w:val="17"/>
+        </w:rPr>
+        <w:t>No extra Pico wire to modem PWR/PWRKEY if the HAT jumper is PWR–3V3 (auto power-on when 5 V is present).</w:t>
+      </w:r>
+    </w:p>
+    <w:p>
+      <w:pPr>
+        <w:pStyle w:val="Heading1"/>
+      </w:pPr>
+      <w:r>
+        <w:t>How power works: V50 + boat switch (TPS2113A + PlusRoc)</w:t>
+      </w:r>
+    </w:p>
+    <w:p>
+      <w:r>
+        <w:rPr>
+          <w:b w:val="0"/>
+          <w:sz w:val="18"/>
+        </w:rPr>
+        <w:t>Pololu TPS2113A picks the higher-priority 5 V source for the Pico:</w:t>
+      </w:r>
+    </w:p>
+    <w:p>
+      <w:pPr>
+        <w:pStyle w:val="ListBullet"/>
+      </w:pPr>
+      <w:r>
+        <w:rPr>
+          <w:sz w:val="18"/>
+        </w:rPr>
+        <w:t>IN1 — V50 USB-A #1 → INA219 → TPS IN1 (battery switch OFF: Pico runs from V50).</w:t>
+      </w:r>
+    </w:p>
+    <w:p>
+      <w:pPr>
+        <w:pStyle w:val="ListBullet"/>
+      </w:pPr>
+      <w:r>
+        <w:rPr>
+          <w:sz w:val="18"/>
+        </w:rPr>
+        <w:t>IN2 — PlusRoc 5 V OUT+ when master battery Switch is ON (charges V50 via USB-C and can feed Pico via TPS).</w:t>
+      </w:r>
+    </w:p>
+    <w:p>
+      <w:pPr>
+        <w:pStyle w:val="ListBullet"/>
+      </w:pPr>
+      <w:r>
+        <w:rPr>
+          <w:sz w:val="18"/>
+        </w:rPr>
+        <w:t>OUT → Pico VSYS pin 39. GND common everywhere.</w:t>
+      </w:r>
+    </w:p>
+    <w:p>
+      <w:r>
+        <w:rPr>
+          <w:b/>
+          <w:sz w:val="18"/>
+        </w:rPr>
+        <w:t>PlusRoc 12 V → 5 V buck (waterproof): IN+ from boat Switch wire; GND to ground bus.</w:t>
       </w:r>
     </w:p>
     <w:tbl>
@@ -40,13 +158,13 @@
         <w:tblLook w:firstColumn="1" w:firstRow="1" w:lastColumn="0" w:lastRow="0" w:noHBand="0" w:noVBand="1" w:val="04A0"/>
       </w:tblPr>
       <w:tblGrid>
-        <w:gridCol w:w="5472"/>
-        <w:gridCol w:w="5472"/>
+        <w:gridCol w:w="5400"/>
+        <w:gridCol w:w="5400"/>
       </w:tblGrid>
       <w:tr>
         <w:tc>
           <w:tcPr>
-            <w:tcW w:type="dxa" w:w="5472"/>
+            <w:tcW w:type="dxa" w:w="5400"/>
           </w:tcPr>
           <w:p>
             <w:r>
@@ -54,285 +172,13 @@
                 <w:b/>
                 <w:sz w:val="16"/>
               </w:rPr>
-              <w:t>Pin</w:t>
+              <w:t>PlusRoc / node</w:t>
             </w:r>
           </w:p>
         </w:tc>
         <w:tc>
           <w:tcPr>
-            <w:tcW w:type="dxa" w:w="5472"/>
-          </w:tcPr>
-          <w:p>
-            <w:r>
-              <w:rPr>
-                <w:b/>
-                <w:sz w:val="16"/>
-              </w:rPr>
-              <w:t>Goes to</w:t>
-            </w:r>
-          </w:p>
-        </w:tc>
-      </w:tr>
-      <w:tr>
-        <w:tc>
-          <w:tcPr>
-            <w:tcW w:type="dxa" w:w="5472"/>
-          </w:tcPr>
-          <w:p>
-            <w:r>
-              <w:rPr>
-                <w:sz w:val="16"/>
-              </w:rPr>
-              <w:t>1, 2</w:t>
-            </w:r>
-          </w:p>
-        </w:tc>
-        <w:tc>
-          <w:tcPr>
-            <w:tcW w:type="dxa" w:w="5472"/>
-          </w:tcPr>
-          <w:p>
-            <w:r>
-              <w:rPr>
-                <w:sz w:val="16"/>
-              </w:rPr>
-              <w:t>Engine INA260 SDA, SCL</w:t>
-            </w:r>
-          </w:p>
-        </w:tc>
-      </w:tr>
-      <w:tr>
-        <w:tc>
-          <w:tcPr>
-            <w:tcW w:type="dxa" w:w="5472"/>
-          </w:tcPr>
-          <w:p>
-            <w:r>
-              <w:rPr>
-                <w:sz w:val="16"/>
-              </w:rPr>
-              <w:t>4, 5</w:t>
-            </w:r>
-          </w:p>
-        </w:tc>
-        <w:tc>
-          <w:tcPr>
-            <w:tcW w:type="dxa" w:w="5472"/>
-          </w:tcPr>
-          <w:p>
-            <w:r>
-              <w:rPr>
-                <w:sz w:val="16"/>
-              </w:rPr>
-              <w:t>House INA260 SDA, SCL</w:t>
-            </w:r>
-          </w:p>
-        </w:tc>
-      </w:tr>
-      <w:tr>
-        <w:tc>
-          <w:tcPr>
-            <w:tcW w:type="dxa" w:w="5472"/>
-          </w:tcPr>
-          <w:p>
-            <w:r>
-              <w:rPr>
-                <w:sz w:val="16"/>
-              </w:rPr>
-              <w:t>6, 7</w:t>
-            </w:r>
-          </w:p>
-        </w:tc>
-        <w:tc>
-          <w:tcPr>
-            <w:tcW w:type="dxa" w:w="5472"/>
-          </w:tcPr>
-          <w:p>
-            <w:r>
-              <w:rPr>
-                <w:sz w:val="16"/>
-              </w:rPr>
-              <w:t>INA219 SDA, SCL</w:t>
-            </w:r>
-          </w:p>
-        </w:tc>
-      </w:tr>
-      <w:tr>
-        <w:tc>
-          <w:tcPr>
-            <w:tcW w:type="dxa" w:w="5472"/>
-          </w:tcPr>
-          <w:p>
-            <w:r>
-              <w:rPr>
-                <w:sz w:val="16"/>
-              </w:rPr>
-              <w:t>9</w:t>
-            </w:r>
-          </w:p>
-        </w:tc>
-        <w:tc>
-          <w:tcPr>
-            <w:tcW w:type="dxa" w:w="5472"/>
-          </w:tcPr>
-          <w:p>
-            <w:r>
-              <w:rPr>
-                <w:sz w:val="16"/>
-              </w:rPr>
-              <w:t>TPS STAT</w:t>
-            </w:r>
-          </w:p>
-        </w:tc>
-      </w:tr>
-      <w:tr>
-        <w:tc>
-          <w:tcPr>
-            <w:tcW w:type="dxa" w:w="5472"/>
-          </w:tcPr>
-          <w:p>
-            <w:r>
-              <w:rPr>
-                <w:sz w:val="16"/>
-              </w:rPr>
-              <w:t>15</w:t>
-            </w:r>
-          </w:p>
-        </w:tc>
-        <w:tc>
-          <w:tcPr>
-            <w:tcW w:type="dxa" w:w="5472"/>
-          </w:tcPr>
-          <w:p>
-            <w:r>
-              <w:rPr>
-                <w:sz w:val="16"/>
-              </w:rPr>
-              <w:t>TPS VSNS (you moved here — keep)</w:t>
-            </w:r>
-          </w:p>
-        </w:tc>
-      </w:tr>
-      <w:tr>
-        <w:tc>
-          <w:tcPr>
-            <w:tcW w:type="dxa" w:w="5472"/>
-          </w:tcPr>
-          <w:p>
-            <w:r>
-              <w:rPr>
-                <w:sz w:val="16"/>
-              </w:rPr>
-              <w:t>17, 19, 20</w:t>
-            </w:r>
-          </w:p>
-        </w:tc>
-        <w:tc>
-          <w:tcPr>
-            <w:tcW w:type="dxa" w:w="5472"/>
-          </w:tcPr>
-          <w:p>
-            <w:r>
-              <w:rPr>
-                <w:sz w:val="16"/>
-              </w:rPr>
-              <w:t>Red, Blue, Green LED</w:t>
-            </w:r>
-          </w:p>
-        </w:tc>
-      </w:tr>
-      <w:tr>
-        <w:tc>
-          <w:tcPr>
-            <w:tcW w:type="dxa" w:w="5472"/>
-          </w:tcPr>
-          <w:p>
-            <w:r>
-              <w:rPr>
-                <w:sz w:val="16"/>
-              </w:rPr>
-              <w:t>39</w:t>
-            </w:r>
-          </w:p>
-        </w:tc>
-        <w:tc>
-          <w:tcPr>
-            <w:tcW w:type="dxa" w:w="5472"/>
-          </w:tcPr>
-          <w:p>
-            <w:r>
-              <w:rPr>
-                <w:sz w:val="16"/>
-              </w:rPr>
-              <w:t>TPS OUT → VSYS</w:t>
-            </w:r>
-          </w:p>
-        </w:tc>
-      </w:tr>
-    </w:tbl>
-    <w:p/>
-    <w:p>
-      <w:r>
-        <w:rPr>
-          <w:b/>
-          <w:sz w:val="16"/>
-        </w:rPr>
-        <w:t>Firmware: Pin(11) for VSNS. Do NOT change I2C or A0/A1. No more unsoldering.</w:t>
-      </w:r>
-    </w:p>
-    <w:p>
-      <w:r>
-        <w:rPr>
-          <w:b w:val="0"/>
-          <w:sz w:val="16"/>
-        </w:rPr>
-        <w:t>INA260 terminals: VIN+ = battery/source side. VIN− = load side (not “OUT”).</w:t>
-      </w:r>
-    </w:p>
-    <w:p>
-      <w:pPr>
-        <w:pStyle w:val="Heading1"/>
-      </w:pPr>
-      <w:r>
-        <w:t>SECTION 2 — STILL TO DO</w:t>
-      </w:r>
-    </w:p>
-    <w:p>
-      <w:pPr>
-        <w:pStyle w:val="Heading2"/>
-      </w:pPr>
-      <w:r>
-        <w:t>SIM7600 (jumpers: UART=B, PWR=PWR-3V3, VCCIO=3.3V)</w:t>
-      </w:r>
-    </w:p>
-    <w:tbl>
-      <w:tblPr>
-        <w:tblStyle w:val="TableGrid"/>
-        <w:tblW w:type="auto" w:w="0"/>
-        <w:tblLook w:firstColumn="1" w:firstRow="1" w:lastColumn="0" w:lastRow="0" w:noHBand="0" w:noVBand="1" w:val="04A0"/>
-      </w:tblPr>
-      <w:tblGrid>
-        <w:gridCol w:w="5472"/>
-        <w:gridCol w:w="5472"/>
-      </w:tblGrid>
-      <w:tr>
-        <w:tc>
-          <w:tcPr>
-            <w:tcW w:type="dxa" w:w="5472"/>
-          </w:tcPr>
-          <w:p>
-            <w:r>
-              <w:rPr>
-                <w:b/>
-                <w:sz w:val="16"/>
-              </w:rPr>
-              <w:t>Modem</w:t>
-            </w:r>
-          </w:p>
-        </w:tc>
-        <w:tc>
-          <w:tcPr>
-            <w:tcW w:type="dxa" w:w="5472"/>
+            <w:tcW w:type="dxa" w:w="5400"/>
           </w:tcPr>
           <w:p>
             <w:r>
@@ -348,27 +194,27 @@
       <w:tr>
         <w:tc>
           <w:tcPr>
-            <w:tcW w:type="dxa" w:w="5472"/>
+            <w:tcW w:type="dxa" w:w="5400"/>
           </w:tcPr>
           <w:p>
             <w:r>
               <w:rPr>
                 <w:sz w:val="16"/>
               </w:rPr>
-              <w:t>5V</w:t>
+              <w:t>IN+</w:t>
             </w:r>
           </w:p>
         </w:tc>
         <w:tc>
           <w:tcPr>
-            <w:tcW w:type="dxa" w:w="5472"/>
+            <w:tcW w:type="dxa" w:w="5400"/>
           </w:tcPr>
           <w:p>
             <w:r>
               <w:rPr>
                 <w:sz w:val="16"/>
               </w:rPr>
-              <w:t>5V rail</w:t>
+              <w:t>Boat Switch (same node as Opto Ch5 IN+ — harness wire #8)</w:t>
             </w:r>
           </w:p>
         </w:tc>
@@ -376,7 +222,91 @@
       <w:tr>
         <w:tc>
           <w:tcPr>
-            <w:tcW w:type="dxa" w:w="5472"/>
+            <w:tcW w:type="dxa" w:w="5400"/>
+          </w:tcPr>
+          <w:p>
+            <w:r>
+              <w:rPr>
+                <w:sz w:val="16"/>
+              </w:rPr>
+              <w:t>OUT+ 5 V</w:t>
+            </w:r>
+          </w:p>
+        </w:tc>
+        <w:tc>
+          <w:tcPr>
+            <w:tcW w:type="dxa" w:w="5400"/>
+          </w:tcPr>
+          <w:p>
+            <w:r>
+              <w:rPr>
+                <w:sz w:val="16"/>
+              </w:rPr>
+              <w:t>TPS2113A IN2 (+)</w:t>
+            </w:r>
+          </w:p>
+        </w:tc>
+      </w:tr>
+      <w:tr>
+        <w:tc>
+          <w:tcPr>
+            <w:tcW w:type="dxa" w:w="5400"/>
+          </w:tcPr>
+          <w:p>
+            <w:r>
+              <w:rPr>
+                <w:sz w:val="16"/>
+              </w:rPr>
+              <w:t>OUT+ 5 V</w:t>
+            </w:r>
+          </w:p>
+        </w:tc>
+        <w:tc>
+          <w:tcPr>
+            <w:tcW w:type="dxa" w:w="5400"/>
+          </w:tcPr>
+          <w:p>
+            <w:r>
+              <w:rPr>
+                <w:sz w:val="16"/>
+              </w:rPr>
+              <w:t>V50 USB-C charge IN (+) direct — no diode on charge path</w:t>
+            </w:r>
+          </w:p>
+        </w:tc>
+      </w:tr>
+      <w:tr>
+        <w:tc>
+          <w:tcPr>
+            <w:tcW w:type="dxa" w:w="5400"/>
+          </w:tcPr>
+          <w:p>
+            <w:r>
+              <w:rPr>
+                <w:sz w:val="16"/>
+              </w:rPr>
+              <w:t>OUT+ 5 V</w:t>
+            </w:r>
+          </w:p>
+        </w:tc>
+        <w:tc>
+          <w:tcPr>
+            <w:tcW w:type="dxa" w:w="5400"/>
+          </w:tcPr>
+          <w:p>
+            <w:r>
+              <w:rPr>
+                <w:sz w:val="16"/>
+              </w:rPr>
+              <w:t>Modem 5 V bus through a diode (OR with V50-A#2)</w:t>
+            </w:r>
+          </w:p>
+        </w:tc>
+      </w:tr>
+      <w:tr>
+        <w:tc>
+          <w:tcPr>
+            <w:tcW w:type="dxa" w:w="5400"/>
           </w:tcPr>
           <w:p>
             <w:r>
@@ -389,7 +319,360 @@
         </w:tc>
         <w:tc>
           <w:tcPr>
-            <w:tcW w:type="dxa" w:w="5472"/>
+            <w:tcW w:type="dxa" w:w="5400"/>
+          </w:tcPr>
+          <w:p>
+            <w:r>
+              <w:rPr>
+                <w:sz w:val="16"/>
+              </w:rPr>
+              <w:t>Ground bus (PlusRoc, V50 −, Pico, modem)</w:t>
+            </w:r>
+          </w:p>
+        </w:tc>
+      </w:tr>
+    </w:tbl>
+    <w:p/>
+    <w:p>
+      <w:pPr>
+        <w:pStyle w:val="Heading2"/>
+      </w:pPr>
+      <w:r>
+        <w:t>V50 — three ports</w:t>
+      </w:r>
+    </w:p>
+    <w:tbl>
+      <w:tblPr>
+        <w:tblStyle w:val="TableGrid"/>
+        <w:tblW w:type="auto" w:w="0"/>
+        <w:tblLook w:firstColumn="1" w:firstRow="1" w:lastColumn="0" w:lastRow="0" w:noHBand="0" w:noVBand="1" w:val="04A0"/>
+      </w:tblPr>
+      <w:tblGrid>
+        <w:gridCol w:w="3600"/>
+        <w:gridCol w:w="3600"/>
+        <w:gridCol w:w="3600"/>
+      </w:tblGrid>
+      <w:tr>
+        <w:tc>
+          <w:tcPr>
+            <w:tcW w:type="dxa" w:w="3600"/>
+          </w:tcPr>
+          <w:p>
+            <w:r>
+              <w:rPr>
+                <w:b/>
+                <w:sz w:val="16"/>
+              </w:rPr>
+              <w:t>Port</w:t>
+            </w:r>
+          </w:p>
+        </w:tc>
+        <w:tc>
+          <w:tcPr>
+            <w:tcW w:type="dxa" w:w="3600"/>
+          </w:tcPr>
+          <w:p>
+            <w:r>
+              <w:rPr>
+                <w:b/>
+                <w:sz w:val="16"/>
+              </w:rPr>
+              <w:t>Direction</w:t>
+            </w:r>
+          </w:p>
+        </w:tc>
+        <w:tc>
+          <w:tcPr>
+            <w:tcW w:type="dxa" w:w="3600"/>
+          </w:tcPr>
+          <w:p>
+            <w:r>
+              <w:rPr>
+                <w:b/>
+                <w:sz w:val="16"/>
+              </w:rPr>
+              <w:t>Connect to</w:t>
+            </w:r>
+          </w:p>
+        </w:tc>
+      </w:tr>
+      <w:tr>
+        <w:tc>
+          <w:tcPr>
+            <w:tcW w:type="dxa" w:w="3600"/>
+          </w:tcPr>
+          <w:p>
+            <w:r>
+              <w:rPr>
+                <w:sz w:val="16"/>
+              </w:rPr>
+              <w:t>USB-A #1</w:t>
+            </w:r>
+          </w:p>
+        </w:tc>
+        <w:tc>
+          <w:tcPr>
+            <w:tcW w:type="dxa" w:w="3600"/>
+          </w:tcPr>
+          <w:p>
+            <w:r>
+              <w:rPr>
+                <w:sz w:val="16"/>
+              </w:rPr>
+              <w:t>OUT</w:t>
+            </w:r>
+          </w:p>
+        </w:tc>
+        <w:tc>
+          <w:tcPr>
+            <w:tcW w:type="dxa" w:w="3600"/>
+          </w:tcPr>
+          <w:p>
+            <w:r>
+              <w:rPr>
+                <w:sz w:val="16"/>
+              </w:rPr>
+              <w:t>INA219 → TPS IN1 → VSYS (DONE)</w:t>
+            </w:r>
+          </w:p>
+        </w:tc>
+      </w:tr>
+      <w:tr>
+        <w:tc>
+          <w:tcPr>
+            <w:tcW w:type="dxa" w:w="3600"/>
+          </w:tcPr>
+          <w:p>
+            <w:r>
+              <w:rPr>
+                <w:sz w:val="16"/>
+              </w:rPr>
+              <w:t>USB-A #2</w:t>
+            </w:r>
+          </w:p>
+        </w:tc>
+        <w:tc>
+          <w:tcPr>
+            <w:tcW w:type="dxa" w:w="3600"/>
+          </w:tcPr>
+          <w:p>
+            <w:r>
+              <w:rPr>
+                <w:sz w:val="16"/>
+              </w:rPr>
+              <w:t>OUT</w:t>
+            </w:r>
+          </w:p>
+        </w:tc>
+        <w:tc>
+          <w:tcPr>
+            <w:tcW w:type="dxa" w:w="3600"/>
+          </w:tcPr>
+          <w:p>
+            <w:r>
+              <w:rPr>
+                <w:sz w:val="16"/>
+              </w:rPr>
+              <w:t>(+) through diode → modem 5 V bus; (−) → ground</w:t>
+            </w:r>
+          </w:p>
+        </w:tc>
+      </w:tr>
+      <w:tr>
+        <w:tc>
+          <w:tcPr>
+            <w:tcW w:type="dxa" w:w="3600"/>
+          </w:tcPr>
+          <w:p>
+            <w:r>
+              <w:rPr>
+                <w:sz w:val="16"/>
+              </w:rPr>
+              <w:t>USB-C</w:t>
+            </w:r>
+          </w:p>
+        </w:tc>
+        <w:tc>
+          <w:tcPr>
+            <w:tcW w:type="dxa" w:w="3600"/>
+          </w:tcPr>
+          <w:p>
+            <w:r>
+              <w:rPr>
+                <w:sz w:val="16"/>
+              </w:rPr>
+              <w:t>IN (charge bank)</w:t>
+            </w:r>
+          </w:p>
+        </w:tc>
+        <w:tc>
+          <w:tcPr>
+            <w:tcW w:type="dxa" w:w="3600"/>
+          </w:tcPr>
+          <w:p>
+            <w:r>
+              <w:rPr>
+                <w:sz w:val="16"/>
+              </w:rPr>
+              <w:t>(+) ← PlusRoc OUT+ direct; (−) → ground</w:t>
+            </w:r>
+          </w:p>
+        </w:tc>
+      </w:tr>
+    </w:tbl>
+    <w:p/>
+    <w:p>
+      <w:r>
+        <w:rPr>
+          <w:b w:val="0"/>
+          <w:sz w:val="16"/>
+        </w:rPr>
+        <w:t>USB-C charges the V50 when Switch is ON (12 V on PlusRoc). Key wire senses ignition only — it does not feed PlusRoc. Do not tie USB-C into the Pico path or modem bus backwards.</w:t>
+      </w:r>
+    </w:p>
+    <w:p>
+      <w:r>
+        <w:rPr>
+          <w:b w:val="0"/>
+          <w:sz w:val="16"/>
+        </w:rPr>
+        <w:t>Passives on 5 V: diodes OR-ing modem feeds (PlusRoc OUT+ and V50 USB-A #2). RUN wake: 10 kΩ from opto OUT1–4 shared node to Pico pin 30. (No capacitor called out in as-built docs.)</w:t>
+      </w:r>
+    </w:p>
+    <w:p>
+      <w:pPr>
+        <w:pStyle w:val="Heading1"/>
+      </w:pPr>
+      <w:r>
+        <w:t>SECTION 1 — Already done (do not change)</w:t>
+      </w:r>
+    </w:p>
+    <w:tbl>
+      <w:tblPr>
+        <w:tblStyle w:val="TableGrid"/>
+        <w:tblW w:type="auto" w:w="0"/>
+        <w:tblLook w:firstColumn="1" w:firstRow="1" w:lastColumn="0" w:lastRow="0" w:noHBand="0" w:noVBand="1" w:val="04A0"/>
+      </w:tblPr>
+      <w:tblGrid>
+        <w:gridCol w:w="3600"/>
+        <w:gridCol w:w="3600"/>
+        <w:gridCol w:w="3600"/>
+      </w:tblGrid>
+      <w:tr>
+        <w:tc>
+          <w:tcPr>
+            <w:tcW w:type="dxa" w:w="3600"/>
+          </w:tcPr>
+          <w:p>
+            <w:r>
+              <w:rPr>
+                <w:b/>
+                <w:sz w:val="16"/>
+              </w:rPr>
+              <w:t>Pico pin</w:t>
+            </w:r>
+          </w:p>
+        </w:tc>
+        <w:tc>
+          <w:tcPr>
+            <w:tcW w:type="dxa" w:w="3600"/>
+          </w:tcPr>
+          <w:p>
+            <w:r>
+              <w:rPr>
+                <w:b/>
+                <w:sz w:val="16"/>
+              </w:rPr>
+              <w:t>GPIO</w:t>
+            </w:r>
+          </w:p>
+        </w:tc>
+        <w:tc>
+          <w:tcPr>
+            <w:tcW w:type="dxa" w:w="3600"/>
+          </w:tcPr>
+          <w:p>
+            <w:r>
+              <w:rPr>
+                <w:b/>
+                <w:sz w:val="16"/>
+              </w:rPr>
+              <w:t>Connected to</w:t>
+            </w:r>
+          </w:p>
+        </w:tc>
+      </w:tr>
+      <w:tr>
+        <w:tc>
+          <w:tcPr>
+            <w:tcW w:type="dxa" w:w="3600"/>
+          </w:tcPr>
+          <w:p>
+            <w:r>
+              <w:rPr>
+                <w:sz w:val="16"/>
+              </w:rPr>
+              <w:t>39</w:t>
+            </w:r>
+          </w:p>
+        </w:tc>
+        <w:tc>
+          <w:tcPr>
+            <w:tcW w:type="dxa" w:w="3600"/>
+          </w:tcPr>
+          <w:p>
+            <w:r>
+              <w:rPr>
+                <w:sz w:val="16"/>
+              </w:rPr>
+              <w:t>VSYS</w:t>
+            </w:r>
+          </w:p>
+        </w:tc>
+        <w:tc>
+          <w:tcPr>
+            <w:tcW w:type="dxa" w:w="3600"/>
+          </w:tcPr>
+          <w:p>
+            <w:r>
+              <w:rPr>
+                <w:sz w:val="16"/>
+              </w:rPr>
+              <w:t>TPS2113A OUT</w:t>
+            </w:r>
+          </w:p>
+        </w:tc>
+      </w:tr>
+      <w:tr>
+        <w:tc>
+          <w:tcPr>
+            <w:tcW w:type="dxa" w:w="3600"/>
+          </w:tcPr>
+          <w:p>
+            <w:r>
+              <w:rPr>
+                <w:sz w:val="16"/>
+              </w:rPr>
+              <w:t>38</w:t>
+            </w:r>
+          </w:p>
+        </w:tc>
+        <w:tc>
+          <w:tcPr>
+            <w:tcW w:type="dxa" w:w="3600"/>
+          </w:tcPr>
+          <w:p>
+            <w:r>
+              <w:rPr>
+                <w:sz w:val="16"/>
+              </w:rPr>
+              <w:t>—</w:t>
+            </w:r>
+          </w:p>
+        </w:tc>
+        <w:tc>
+          <w:tcPr>
+            <w:tcW w:type="dxa" w:w="3600"/>
           </w:tcPr>
           <w:p>
             <w:r>
@@ -404,7 +687,640 @@
       <w:tr>
         <w:tc>
           <w:tcPr>
-            <w:tcW w:type="dxa" w:w="5472"/>
+            <w:tcW w:type="dxa" w:w="3600"/>
+          </w:tcPr>
+          <w:p>
+            <w:r>
+              <w:rPr>
+                <w:sz w:val="16"/>
+              </w:rPr>
+              <w:t>36</w:t>
+            </w:r>
+          </w:p>
+        </w:tc>
+        <w:tc>
+          <w:tcPr>
+            <w:tcW w:type="dxa" w:w="3600"/>
+          </w:tcPr>
+          <w:p>
+            <w:r>
+              <w:rPr>
+                <w:sz w:val="16"/>
+              </w:rPr>
+              <w:t>3V3</w:t>
+            </w:r>
+          </w:p>
+        </w:tc>
+        <w:tc>
+          <w:tcPr>
+            <w:tcW w:type="dxa" w:w="3600"/>
+          </w:tcPr>
+          <w:p>
+            <w:r>
+              <w:rPr>
+                <w:sz w:val="16"/>
+              </w:rPr>
+              <w:t>+ rail → sensor Vcc</w:t>
+            </w:r>
+          </w:p>
+        </w:tc>
+      </w:tr>
+      <w:tr>
+        <w:tc>
+          <w:tcPr>
+            <w:tcW w:type="dxa" w:w="3600"/>
+          </w:tcPr>
+          <w:p>
+            <w:r>
+              <w:rPr>
+                <w:sz w:val="16"/>
+              </w:rPr>
+              <w:t>1</w:t>
+            </w:r>
+          </w:p>
+        </w:tc>
+        <w:tc>
+          <w:tcPr>
+            <w:tcW w:type="dxa" w:w="3600"/>
+          </w:tcPr>
+          <w:p>
+            <w:r>
+              <w:rPr>
+                <w:sz w:val="16"/>
+              </w:rPr>
+              <w:t>GP0</w:t>
+            </w:r>
+          </w:p>
+        </w:tc>
+        <w:tc>
+          <w:tcPr>
+            <w:tcW w:type="dxa" w:w="3600"/>
+          </w:tcPr>
+          <w:p>
+            <w:r>
+              <w:rPr>
+                <w:sz w:val="16"/>
+              </w:rPr>
+              <w:t>Engine INA260 SDA</w:t>
+            </w:r>
+          </w:p>
+        </w:tc>
+      </w:tr>
+      <w:tr>
+        <w:tc>
+          <w:tcPr>
+            <w:tcW w:type="dxa" w:w="3600"/>
+          </w:tcPr>
+          <w:p>
+            <w:r>
+              <w:rPr>
+                <w:sz w:val="16"/>
+              </w:rPr>
+              <w:t>2</w:t>
+            </w:r>
+          </w:p>
+        </w:tc>
+        <w:tc>
+          <w:tcPr>
+            <w:tcW w:type="dxa" w:w="3600"/>
+          </w:tcPr>
+          <w:p>
+            <w:r>
+              <w:rPr>
+                <w:sz w:val="16"/>
+              </w:rPr>
+              <w:t>GP1</w:t>
+            </w:r>
+          </w:p>
+        </w:tc>
+        <w:tc>
+          <w:tcPr>
+            <w:tcW w:type="dxa" w:w="3600"/>
+          </w:tcPr>
+          <w:p>
+            <w:r>
+              <w:rPr>
+                <w:sz w:val="16"/>
+              </w:rPr>
+              <w:t>Engine INA260 SCL</w:t>
+            </w:r>
+          </w:p>
+        </w:tc>
+      </w:tr>
+      <w:tr>
+        <w:tc>
+          <w:tcPr>
+            <w:tcW w:type="dxa" w:w="3600"/>
+          </w:tcPr>
+          <w:p>
+            <w:r>
+              <w:rPr>
+                <w:sz w:val="16"/>
+              </w:rPr>
+              <w:t>4</w:t>
+            </w:r>
+          </w:p>
+        </w:tc>
+        <w:tc>
+          <w:tcPr>
+            <w:tcW w:type="dxa" w:w="3600"/>
+          </w:tcPr>
+          <w:p>
+            <w:r>
+              <w:rPr>
+                <w:sz w:val="16"/>
+              </w:rPr>
+              <w:t>GP2</w:t>
+            </w:r>
+          </w:p>
+        </w:tc>
+        <w:tc>
+          <w:tcPr>
+            <w:tcW w:type="dxa" w:w="3600"/>
+          </w:tcPr>
+          <w:p>
+            <w:r>
+              <w:rPr>
+                <w:sz w:val="16"/>
+              </w:rPr>
+              <w:t>House INA260 SDA</w:t>
+            </w:r>
+          </w:p>
+        </w:tc>
+      </w:tr>
+      <w:tr>
+        <w:tc>
+          <w:tcPr>
+            <w:tcW w:type="dxa" w:w="3600"/>
+          </w:tcPr>
+          <w:p>
+            <w:r>
+              <w:rPr>
+                <w:sz w:val="16"/>
+              </w:rPr>
+              <w:t>5</w:t>
+            </w:r>
+          </w:p>
+        </w:tc>
+        <w:tc>
+          <w:tcPr>
+            <w:tcW w:type="dxa" w:w="3600"/>
+          </w:tcPr>
+          <w:p>
+            <w:r>
+              <w:rPr>
+                <w:sz w:val="16"/>
+              </w:rPr>
+              <w:t>GP3</w:t>
+            </w:r>
+          </w:p>
+        </w:tc>
+        <w:tc>
+          <w:tcPr>
+            <w:tcW w:type="dxa" w:w="3600"/>
+          </w:tcPr>
+          <w:p>
+            <w:r>
+              <w:rPr>
+                <w:sz w:val="16"/>
+              </w:rPr>
+              <w:t>House INA260 SCL</w:t>
+            </w:r>
+          </w:p>
+        </w:tc>
+      </w:tr>
+      <w:tr>
+        <w:tc>
+          <w:tcPr>
+            <w:tcW w:type="dxa" w:w="3600"/>
+          </w:tcPr>
+          <w:p>
+            <w:r>
+              <w:rPr>
+                <w:sz w:val="16"/>
+              </w:rPr>
+              <w:t>6</w:t>
+            </w:r>
+          </w:p>
+        </w:tc>
+        <w:tc>
+          <w:tcPr>
+            <w:tcW w:type="dxa" w:w="3600"/>
+          </w:tcPr>
+          <w:p>
+            <w:r>
+              <w:rPr>
+                <w:sz w:val="16"/>
+              </w:rPr>
+              <w:t>GP4</w:t>
+            </w:r>
+          </w:p>
+        </w:tc>
+        <w:tc>
+          <w:tcPr>
+            <w:tcW w:type="dxa" w:w="3600"/>
+          </w:tcPr>
+          <w:p>
+            <w:r>
+              <w:rPr>
+                <w:sz w:val="16"/>
+              </w:rPr>
+              <w:t>INA219 SDA</w:t>
+            </w:r>
+          </w:p>
+        </w:tc>
+      </w:tr>
+      <w:tr>
+        <w:tc>
+          <w:tcPr>
+            <w:tcW w:type="dxa" w:w="3600"/>
+          </w:tcPr>
+          <w:p>
+            <w:r>
+              <w:rPr>
+                <w:sz w:val="16"/>
+              </w:rPr>
+              <w:t>7</w:t>
+            </w:r>
+          </w:p>
+        </w:tc>
+        <w:tc>
+          <w:tcPr>
+            <w:tcW w:type="dxa" w:w="3600"/>
+          </w:tcPr>
+          <w:p>
+            <w:r>
+              <w:rPr>
+                <w:sz w:val="16"/>
+              </w:rPr>
+              <w:t>GP5</w:t>
+            </w:r>
+          </w:p>
+        </w:tc>
+        <w:tc>
+          <w:tcPr>
+            <w:tcW w:type="dxa" w:w="3600"/>
+          </w:tcPr>
+          <w:p>
+            <w:r>
+              <w:rPr>
+                <w:sz w:val="16"/>
+              </w:rPr>
+              <w:t>INA219 SCL</w:t>
+            </w:r>
+          </w:p>
+        </w:tc>
+      </w:tr>
+      <w:tr>
+        <w:tc>
+          <w:tcPr>
+            <w:tcW w:type="dxa" w:w="3600"/>
+          </w:tcPr>
+          <w:p>
+            <w:r>
+              <w:rPr>
+                <w:sz w:val="16"/>
+              </w:rPr>
+              <w:t>9</w:t>
+            </w:r>
+          </w:p>
+        </w:tc>
+        <w:tc>
+          <w:tcPr>
+            <w:tcW w:type="dxa" w:w="3600"/>
+          </w:tcPr>
+          <w:p>
+            <w:r>
+              <w:rPr>
+                <w:sz w:val="16"/>
+              </w:rPr>
+              <w:t>GP6</w:t>
+            </w:r>
+          </w:p>
+        </w:tc>
+        <w:tc>
+          <w:tcPr>
+            <w:tcW w:type="dxa" w:w="3600"/>
+          </w:tcPr>
+          <w:p>
+            <w:r>
+              <w:rPr>
+                <w:sz w:val="16"/>
+              </w:rPr>
+              <w:t>TPS STAT</w:t>
+            </w:r>
+          </w:p>
+        </w:tc>
+      </w:tr>
+      <w:tr>
+        <w:tc>
+          <w:tcPr>
+            <w:tcW w:type="dxa" w:w="3600"/>
+          </w:tcPr>
+          <w:p>
+            <w:r>
+              <w:rPr>
+                <w:sz w:val="16"/>
+              </w:rPr>
+              <w:t>15</w:t>
+            </w:r>
+          </w:p>
+        </w:tc>
+        <w:tc>
+          <w:tcPr>
+            <w:tcW w:type="dxa" w:w="3600"/>
+          </w:tcPr>
+          <w:p>
+            <w:r>
+              <w:rPr>
+                <w:sz w:val="16"/>
+              </w:rPr>
+              <w:t>GP11</w:t>
+            </w:r>
+          </w:p>
+        </w:tc>
+        <w:tc>
+          <w:tcPr>
+            <w:tcW w:type="dxa" w:w="3600"/>
+          </w:tcPr>
+          <w:p>
+            <w:r>
+              <w:rPr>
+                <w:sz w:val="16"/>
+              </w:rPr>
+              <w:t>TPS VSNS (keep here)</w:t>
+            </w:r>
+          </w:p>
+        </w:tc>
+      </w:tr>
+      <w:tr>
+        <w:tc>
+          <w:tcPr>
+            <w:tcW w:type="dxa" w:w="3600"/>
+          </w:tcPr>
+          <w:p>
+            <w:r>
+              <w:rPr>
+                <w:sz w:val="16"/>
+              </w:rPr>
+              <w:t>17</w:t>
+            </w:r>
+          </w:p>
+        </w:tc>
+        <w:tc>
+          <w:tcPr>
+            <w:tcW w:type="dxa" w:w="3600"/>
+          </w:tcPr>
+          <w:p>
+            <w:r>
+              <w:rPr>
+                <w:sz w:val="16"/>
+              </w:rPr>
+              <w:t>GP13</w:t>
+            </w:r>
+          </w:p>
+        </w:tc>
+        <w:tc>
+          <w:tcPr>
+            <w:tcW w:type="dxa" w:w="3600"/>
+          </w:tcPr>
+          <w:p>
+            <w:r>
+              <w:rPr>
+                <w:sz w:val="16"/>
+              </w:rPr>
+              <w:t>Red LED</w:t>
+            </w:r>
+          </w:p>
+        </w:tc>
+      </w:tr>
+      <w:tr>
+        <w:tc>
+          <w:tcPr>
+            <w:tcW w:type="dxa" w:w="3600"/>
+          </w:tcPr>
+          <w:p>
+            <w:r>
+              <w:rPr>
+                <w:sz w:val="16"/>
+              </w:rPr>
+              <w:t>19</w:t>
+            </w:r>
+          </w:p>
+        </w:tc>
+        <w:tc>
+          <w:tcPr>
+            <w:tcW w:type="dxa" w:w="3600"/>
+          </w:tcPr>
+          <w:p>
+            <w:r>
+              <w:rPr>
+                <w:sz w:val="16"/>
+              </w:rPr>
+              <w:t>GP14</w:t>
+            </w:r>
+          </w:p>
+        </w:tc>
+        <w:tc>
+          <w:tcPr>
+            <w:tcW w:type="dxa" w:w="3600"/>
+          </w:tcPr>
+          <w:p>
+            <w:r>
+              <w:rPr>
+                <w:sz w:val="16"/>
+              </w:rPr>
+              <w:t>Blue LED</w:t>
+            </w:r>
+          </w:p>
+        </w:tc>
+      </w:tr>
+      <w:tr>
+        <w:tc>
+          <w:tcPr>
+            <w:tcW w:type="dxa" w:w="3600"/>
+          </w:tcPr>
+          <w:p>
+            <w:r>
+              <w:rPr>
+                <w:sz w:val="16"/>
+              </w:rPr>
+              <w:t>20</w:t>
+            </w:r>
+          </w:p>
+        </w:tc>
+        <w:tc>
+          <w:tcPr>
+            <w:tcW w:type="dxa" w:w="3600"/>
+          </w:tcPr>
+          <w:p>
+            <w:r>
+              <w:rPr>
+                <w:sz w:val="16"/>
+              </w:rPr>
+              <w:t>GP15</w:t>
+            </w:r>
+          </w:p>
+        </w:tc>
+        <w:tc>
+          <w:tcPr>
+            <w:tcW w:type="dxa" w:w="3600"/>
+          </w:tcPr>
+          <w:p>
+            <w:r>
+              <w:rPr>
+                <w:sz w:val="16"/>
+              </w:rPr>
+              <w:t>Green LED</w:t>
+            </w:r>
+          </w:p>
+        </w:tc>
+      </w:tr>
+    </w:tbl>
+    <w:p/>
+    <w:p>
+      <w:r>
+        <w:rPr>
+          <w:b w:val="0"/>
+          <w:sz w:val="16"/>
+        </w:rPr>
+        <w:t>INA260: VIN+ = battery/source side; VIN− = load side. Float 12 V tees to House VIN+.</w:t>
+      </w:r>
+    </w:p>
+    <w:p>
+      <w:r>
+        <w:rPr>
+          <w:b w:val="0"/>
+          <w:sz w:val="16"/>
+        </w:rPr>
+        <w:t>Firmware VSNS: Pin(11, OUT) + value(0) — physical pin 15.</w:t>
+      </w:r>
+    </w:p>
+    <w:p>
+      <w:pPr>
+        <w:pStyle w:val="Heading1"/>
+      </w:pPr>
+      <w:r>
+        <w:t>SECTION 2 — Still to do (new wires only)</w:t>
+      </w:r>
+    </w:p>
+    <w:p>
+      <w:pPr>
+        <w:pStyle w:val="Heading2"/>
+      </w:pPr>
+      <w:r>
+        <w:t>SIM7600X modem</w:t>
+      </w:r>
+    </w:p>
+    <w:p>
+      <w:r>
+        <w:rPr>
+          <w:b/>
+          <w:sz w:val="17"/>
+        </w:rPr>
+        <w:t>HAT jumpers: UART = B · PWR = PWR–3V3 · VCCIO = 3.3 V · Flight = NC</w:t>
+      </w:r>
+    </w:p>
+    <w:tbl>
+      <w:tblPr>
+        <w:tblStyle w:val="TableGrid"/>
+        <w:tblW w:type="auto" w:w="0"/>
+        <w:tblLook w:firstColumn="1" w:firstRow="1" w:lastColumn="0" w:lastRow="0" w:noHBand="0" w:noVBand="1" w:val="04A0"/>
+      </w:tblPr>
+      <w:tblGrid>
+        <w:gridCol w:w="5400"/>
+        <w:gridCol w:w="5400"/>
+      </w:tblGrid>
+      <w:tr>
+        <w:tc>
+          <w:tcPr>
+            <w:tcW w:type="dxa" w:w="5400"/>
+          </w:tcPr>
+          <w:p>
+            <w:r>
+              <w:rPr>
+                <w:b/>
+                <w:sz w:val="16"/>
+              </w:rPr>
+              <w:t>Modem</w:t>
+            </w:r>
+          </w:p>
+        </w:tc>
+        <w:tc>
+          <w:tcPr>
+            <w:tcW w:type="dxa" w:w="5400"/>
+          </w:tcPr>
+          <w:p>
+            <w:r>
+              <w:rPr>
+                <w:b/>
+                <w:sz w:val="16"/>
+              </w:rPr>
+              <w:t>Connect to</w:t>
+            </w:r>
+          </w:p>
+        </w:tc>
+      </w:tr>
+      <w:tr>
+        <w:tc>
+          <w:tcPr>
+            <w:tcW w:type="dxa" w:w="5400"/>
+          </w:tcPr>
+          <w:p>
+            <w:r>
+              <w:rPr>
+                <w:sz w:val="16"/>
+              </w:rPr>
+              <w:t>5 V</w:t>
+            </w:r>
+          </w:p>
+        </w:tc>
+        <w:tc>
+          <w:tcPr>
+            <w:tcW w:type="dxa" w:w="5400"/>
+          </w:tcPr>
+          <w:p>
+            <w:r>
+              <w:rPr>
+                <w:sz w:val="16"/>
+              </w:rPr>
+              <w:t>Modem 5 V bus (diode-OR from PlusRoc and/or V50 USB-A #2) — not Pico 3V3</w:t>
+            </w:r>
+          </w:p>
+        </w:tc>
+      </w:tr>
+      <w:tr>
+        <w:tc>
+          <w:tcPr>
+            <w:tcW w:type="dxa" w:w="5400"/>
+          </w:tcPr>
+          <w:p>
+            <w:r>
+              <w:rPr>
+                <w:sz w:val="16"/>
+              </w:rPr>
+              <w:t>GND</w:t>
+            </w:r>
+          </w:p>
+        </w:tc>
+        <w:tc>
+          <w:tcPr>
+            <w:tcW w:type="dxa" w:w="5400"/>
+          </w:tcPr>
+          <w:p>
+            <w:r>
+              <w:rPr>
+                <w:sz w:val="16"/>
+              </w:rPr>
+              <w:t>GND rail</w:t>
+            </w:r>
+          </w:p>
+        </w:tc>
+      </w:tr>
+      <w:tr>
+        <w:tc>
+          <w:tcPr>
+            <w:tcW w:type="dxa" w:w="5400"/>
           </w:tcPr>
           <w:p>
             <w:r>
@@ -417,14 +1333,14 @@
         </w:tc>
         <w:tc>
           <w:tcPr>
-            <w:tcW w:type="dxa" w:w="5472"/>
+            <w:tcW w:type="dxa" w:w="5400"/>
           </w:tcPr>
           <w:p>
             <w:r>
               <w:rPr>
                 <w:sz w:val="16"/>
               </w:rPr>
-              <w:t>Pico pin 11</w:t>
+              <w:t>Pico pin 11 (GP8)</w:t>
             </w:r>
           </w:p>
         </w:tc>
@@ -432,7 +1348,7 @@
       <w:tr>
         <w:tc>
           <w:tcPr>
-            <w:tcW w:type="dxa" w:w="5472"/>
+            <w:tcW w:type="dxa" w:w="5400"/>
           </w:tcPr>
           <w:p>
             <w:r>
@@ -445,14 +1361,14 @@
         </w:tc>
         <w:tc>
           <w:tcPr>
-            <w:tcW w:type="dxa" w:w="5472"/>
+            <w:tcW w:type="dxa" w:w="5400"/>
           </w:tcPr>
           <w:p>
             <w:r>
               <w:rPr>
                 <w:sz w:val="16"/>
               </w:rPr>
-              <w:t>Pico pin 12</w:t>
+              <w:t>Pico pin 12 (GP9)</w:t>
             </w:r>
           </w:p>
         </w:tc>
@@ -460,7 +1376,7 @@
       <w:tr>
         <w:tc>
           <w:tcPr>
-            <w:tcW w:type="dxa" w:w="5472"/>
+            <w:tcW w:type="dxa" w:w="5400"/>
           </w:tcPr>
           <w:p>
             <w:r>
@@ -473,14 +1389,42 @@
         </w:tc>
         <w:tc>
           <w:tcPr>
-            <w:tcW w:type="dxa" w:w="5472"/>
+            <w:tcW w:type="dxa" w:w="5400"/>
           </w:tcPr>
           <w:p>
             <w:r>
               <w:rPr>
                 <w:sz w:val="16"/>
               </w:rPr>
-              <w:t>Pico pin 14 (same side as UART)</w:t>
+              <w:t>Pico pin 14 (GP10) — reset when hung; not PWRKEY</w:t>
+            </w:r>
+          </w:p>
+        </w:tc>
+      </w:tr>
+      <w:tr>
+        <w:tc>
+          <w:tcPr>
+            <w:tcW w:type="dxa" w:w="5400"/>
+          </w:tcPr>
+          <w:p>
+            <w:r>
+              <w:rPr>
+                <w:sz w:val="16"/>
+              </w:rPr>
+              <w:t>Antennas</w:t>
+            </w:r>
+          </w:p>
+        </w:tc>
+        <w:tc>
+          <w:tcPr>
+            <w:tcW w:type="dxa" w:w="5400"/>
+          </w:tcPr>
+          <w:p>
+            <w:r>
+              <w:rPr>
+                <w:sz w:val="16"/>
+              </w:rPr>
+              <w:t>MAIN U.FL / GNSS SMA</w:t>
             </w:r>
           </w:p>
         </w:tc>
@@ -488,11 +1432,20 @@
     </w:tbl>
     <w:p/>
     <w:p>
+      <w:r>
+        <w:rPr>
+          <w:b w:val="0"/>
+          <w:sz w:val="16"/>
+        </w:rPr>
+        <w:t>RST pulse recovers a stuck modem; it does not power on a module after AT+CPOF full power-off (that needs 5 V cycle or PWRKEY). Normal use: leave PWR on HAT jumper, use firmware reset only.</w:t>
+      </w:r>
+    </w:p>
+    <w:p>
       <w:pPr>
         <w:pStyle w:val="Heading2"/>
       </w:pPr>
       <w:r>
-        <w:t>Optocoupler — INPUT side (12V boat)</w:t>
+        <w:t>Optocoupler — boat 12 V inputs</w:t>
       </w:r>
     </w:p>
     <w:tbl>
@@ -502,13 +1455,13 @@
         <w:tblLook w:firstColumn="1" w:firstRow="1" w:lastColumn="0" w:lastRow="0" w:noHBand="0" w:noVBand="1" w:val="04A0"/>
       </w:tblPr>
       <w:tblGrid>
-        <w:gridCol w:w="5472"/>
-        <w:gridCol w:w="5472"/>
+        <w:gridCol w:w="5400"/>
+        <w:gridCol w:w="5400"/>
       </w:tblGrid>
       <w:tr>
         <w:tc>
           <w:tcPr>
-            <w:tcW w:type="dxa" w:w="5472"/>
+            <w:tcW w:type="dxa" w:w="5400"/>
           </w:tcPr>
           <w:p>
             <w:r>
@@ -522,7 +1475,7 @@
         </w:tc>
         <w:tc>
           <w:tcPr>
-            <w:tcW w:type="dxa" w:w="5472"/>
+            <w:tcW w:type="dxa" w:w="5400"/>
           </w:tcPr>
           <w:p>
             <w:r>
@@ -538,7 +1491,7 @@
       <w:tr>
         <w:tc>
           <w:tcPr>
-            <w:tcW w:type="dxa" w:w="5472"/>
+            <w:tcW w:type="dxa" w:w="5400"/>
           </w:tcPr>
           <w:p>
             <w:r>
@@ -551,14 +1504,14 @@
         </w:tc>
         <w:tc>
           <w:tcPr>
-            <w:tcW w:type="dxa" w:w="5472"/>
+            <w:tcW w:type="dxa" w:w="5400"/>
           </w:tcPr>
           <w:p>
             <w:r>
               <w:rPr>
                 <w:sz w:val="16"/>
               </w:rPr>
-              <w:t>Mid bildge</w:t>
+              <w:t>Mid bilge</w:t>
             </w:r>
           </w:p>
         </w:tc>
@@ -566,7 +1519,7 @@
       <w:tr>
         <w:tc>
           <w:tcPr>
-            <w:tcW w:type="dxa" w:w="5472"/>
+            <w:tcW w:type="dxa" w:w="5400"/>
           </w:tcPr>
           <w:p>
             <w:r>
@@ -579,14 +1532,14 @@
         </w:tc>
         <w:tc>
           <w:tcPr>
-            <w:tcW w:type="dxa" w:w="5472"/>
+            <w:tcW w:type="dxa" w:w="5400"/>
           </w:tcPr>
           <w:p>
             <w:r>
               <w:rPr>
                 <w:sz w:val="16"/>
               </w:rPr>
-              <w:t>Aft bilgde</w:t>
+              <w:t>Aft bilge</w:t>
             </w:r>
           </w:p>
         </w:tc>
@@ -594,7 +1547,7 @@
       <w:tr>
         <w:tc>
           <w:tcPr>
-            <w:tcW w:type="dxa" w:w="5472"/>
+            <w:tcW w:type="dxa" w:w="5400"/>
           </w:tcPr>
           <w:p>
             <w:r>
@@ -607,14 +1560,14 @@
         </w:tc>
         <w:tc>
           <w:tcPr>
-            <w:tcW w:type="dxa" w:w="5472"/>
+            <w:tcW w:type="dxa" w:w="5400"/>
           </w:tcPr>
           <w:p>
             <w:r>
               <w:rPr>
                 <w:sz w:val="16"/>
               </w:rPr>
-              <w:t>Mid water return</w:t>
+              <w:t>Mid water (return)</w:t>
             </w:r>
           </w:p>
         </w:tc>
@@ -622,7 +1575,7 @@
       <w:tr>
         <w:tc>
           <w:tcPr>
-            <w:tcW w:type="dxa" w:w="5472"/>
+            <w:tcW w:type="dxa" w:w="5400"/>
           </w:tcPr>
           <w:p>
             <w:r>
@@ -635,14 +1588,14 @@
         </w:tc>
         <w:tc>
           <w:tcPr>
-            <w:tcW w:type="dxa" w:w="5472"/>
+            <w:tcW w:type="dxa" w:w="5400"/>
           </w:tcPr>
           <w:p>
             <w:r>
               <w:rPr>
                 <w:sz w:val="16"/>
               </w:rPr>
-              <w:t>Aft water return</w:t>
+              <w:t>Aft water (return)</w:t>
             </w:r>
           </w:p>
         </w:tc>
@@ -650,7 +1603,7 @@
       <w:tr>
         <w:tc>
           <w:tcPr>
-            <w:tcW w:type="dxa" w:w="5472"/>
+            <w:tcW w:type="dxa" w:w="5400"/>
           </w:tcPr>
           <w:p>
             <w:r>
@@ -663,14 +1616,14 @@
         </w:tc>
         <w:tc>
           <w:tcPr>
-            <w:tcW w:type="dxa" w:w="5472"/>
+            <w:tcW w:type="dxa" w:w="5400"/>
           </w:tcPr>
           <w:p>
             <w:r>
               <w:rPr>
                 <w:sz w:val="16"/>
               </w:rPr>
-              <w:t>Switch (also → PlusRoc IN+)</w:t>
+              <w:t>Switch → also PlusRoc IN+</w:t>
             </w:r>
           </w:p>
         </w:tc>
@@ -678,7 +1631,7 @@
       <w:tr>
         <w:tc>
           <w:tcPr>
-            <w:tcW w:type="dxa" w:w="5472"/>
+            <w:tcW w:type="dxa" w:w="5400"/>
           </w:tcPr>
           <w:p>
             <w:r>
@@ -691,7 +1644,7 @@
         </w:tc>
         <w:tc>
           <w:tcPr>
-            <w:tcW w:type="dxa" w:w="5472"/>
+            <w:tcW w:type="dxa" w:w="5400"/>
           </w:tcPr>
           <w:p>
             <w:r>
@@ -706,7 +1659,7 @@
       <w:tr>
         <w:tc>
           <w:tcPr>
-            <w:tcW w:type="dxa" w:w="5472"/>
+            <w:tcW w:type="dxa" w:w="5400"/>
           </w:tcPr>
           <w:p>
             <w:r>
@@ -719,7 +1672,7 @@
         </w:tc>
         <w:tc>
           <w:tcPr>
-            <w:tcW w:type="dxa" w:w="5472"/>
+            <w:tcW w:type="dxa" w:w="5400"/>
           </w:tcPr>
           <w:p>
             <w:r>
@@ -738,7 +1691,7 @@
         <w:pStyle w:val="Heading2"/>
       </w:pPr>
       <w:r>
-        <w:t>Optocoupler — OUTPUT side (3.3V Pico)</w:t>
+        <w:t>Optocoupler — Pico 3.3 V outputs</w:t>
       </w:r>
     </w:p>
     <w:tbl>
@@ -748,15 +1701,16 @@
         <w:tblLook w:firstColumn="1" w:firstRow="1" w:lastColumn="0" w:lastRow="0" w:noHBand="0" w:noVBand="1" w:val="04A0"/>
       </w:tblPr>
       <w:tblGrid>
-        <w:gridCol w:w="2736"/>
-        <w:gridCol w:w="2736"/>
-        <w:gridCol w:w="2736"/>
-        <w:gridCol w:w="2736"/>
+        <w:gridCol w:w="2160"/>
+        <w:gridCol w:w="2160"/>
+        <w:gridCol w:w="2160"/>
+        <w:gridCol w:w="2160"/>
+        <w:gridCol w:w="2160"/>
       </w:tblGrid>
       <w:tr>
         <w:tc>
           <w:tcPr>
-            <w:tcW w:type="dxa" w:w="2736"/>
+            <w:tcW w:type="dxa" w:w="2160"/>
           </w:tcPr>
           <w:p>
             <w:r>
@@ -770,7 +1724,7 @@
         </w:tc>
         <w:tc>
           <w:tcPr>
-            <w:tcW w:type="dxa" w:w="2736"/>
+            <w:tcW w:type="dxa" w:w="2160"/>
           </w:tcPr>
           <w:p>
             <w:r>
@@ -778,13 +1732,27 @@
                 <w:b/>
                 <w:sz w:val="16"/>
               </w:rPr>
-              <w:t>Pico pin</w:t>
+              <w:t>Pin</w:t>
             </w:r>
           </w:p>
         </w:tc>
         <w:tc>
           <w:tcPr>
-            <w:tcW w:type="dxa" w:w="2736"/>
+            <w:tcW w:type="dxa" w:w="2160"/>
+          </w:tcPr>
+          <w:p>
+            <w:r>
+              <w:rPr>
+                <w:b/>
+                <w:sz w:val="16"/>
+              </w:rPr>
+              <w:t>GPIO</w:t>
+            </w:r>
+          </w:p>
+        </w:tc>
+        <w:tc>
+          <w:tcPr>
+            <w:tcW w:type="dxa" w:w="2160"/>
           </w:tcPr>
           <w:p>
             <w:r>
@@ -798,7 +1766,7 @@
         </w:tc>
         <w:tc>
           <w:tcPr>
-            <w:tcW w:type="dxa" w:w="2736"/>
+            <w:tcW w:type="dxa" w:w="2160"/>
           </w:tcPr>
           <w:p>
             <w:r>
@@ -806,7 +1774,7 @@
                 <w:b/>
                 <w:sz w:val="16"/>
               </w:rPr>
-              <w:t>RUN?</w:t>
+              <w:t>RUN wake?</w:t>
             </w:r>
           </w:p>
         </w:tc>
@@ -814,7 +1782,7 @@
       <w:tr>
         <w:tc>
           <w:tcPr>
-            <w:tcW w:type="dxa" w:w="2736"/>
+            <w:tcW w:type="dxa" w:w="2160"/>
           </w:tcPr>
           <w:p>
             <w:r>
@@ -827,7 +1795,7 @@
         </w:tc>
         <w:tc>
           <w:tcPr>
-            <w:tcW w:type="dxa" w:w="2736"/>
+            <w:tcW w:type="dxa" w:w="2160"/>
           </w:tcPr>
           <w:p>
             <w:r>
@@ -840,7 +1808,20 @@
         </w:tc>
         <w:tc>
           <w:tcPr>
-            <w:tcW w:type="dxa" w:w="2736"/>
+            <w:tcW w:type="dxa" w:w="2160"/>
+          </w:tcPr>
+          <w:p>
+            <w:r>
+              <w:rPr>
+                <w:sz w:val="16"/>
+              </w:rPr>
+              <w:t>GP26</w:t>
+            </w:r>
+          </w:p>
+        </w:tc>
+        <w:tc>
+          <w:tcPr>
+            <w:tcW w:type="dxa" w:w="2160"/>
           </w:tcPr>
           <w:p>
             <w:r>
@@ -853,7 +1834,7 @@
         </w:tc>
         <w:tc>
           <w:tcPr>
-            <w:tcW w:type="dxa" w:w="2736"/>
+            <w:tcW w:type="dxa" w:w="2160"/>
           </w:tcPr>
           <w:p>
             <w:r>
@@ -868,7 +1849,7 @@
       <w:tr>
         <w:tc>
           <w:tcPr>
-            <w:tcW w:type="dxa" w:w="2736"/>
+            <w:tcW w:type="dxa" w:w="2160"/>
           </w:tcPr>
           <w:p>
             <w:r>
@@ -881,7 +1862,7 @@
         </w:tc>
         <w:tc>
           <w:tcPr>
-            <w:tcW w:type="dxa" w:w="2736"/>
+            <w:tcW w:type="dxa" w:w="2160"/>
           </w:tcPr>
           <w:p>
             <w:r>
@@ -894,7 +1875,20 @@
         </w:tc>
         <w:tc>
           <w:tcPr>
-            <w:tcW w:type="dxa" w:w="2736"/>
+            <w:tcW w:type="dxa" w:w="2160"/>
+          </w:tcPr>
+          <w:p>
+            <w:r>
+              <w:rPr>
+                <w:sz w:val="16"/>
+              </w:rPr>
+              <w:t>GP22</w:t>
+            </w:r>
+          </w:p>
+        </w:tc>
+        <w:tc>
+          <w:tcPr>
+            <w:tcW w:type="dxa" w:w="2160"/>
           </w:tcPr>
           <w:p>
             <w:r>
@@ -907,7 +1901,7 @@
         </w:tc>
         <w:tc>
           <w:tcPr>
-            <w:tcW w:type="dxa" w:w="2736"/>
+            <w:tcW w:type="dxa" w:w="2160"/>
           </w:tcPr>
           <w:p>
             <w:r>
@@ -922,7 +1916,7 @@
       <w:tr>
         <w:tc>
           <w:tcPr>
-            <w:tcW w:type="dxa" w:w="2736"/>
+            <w:tcW w:type="dxa" w:w="2160"/>
           </w:tcPr>
           <w:p>
             <w:r>
@@ -935,7 +1929,7 @@
         </w:tc>
         <w:tc>
           <w:tcPr>
-            <w:tcW w:type="dxa" w:w="2736"/>
+            <w:tcW w:type="dxa" w:w="2160"/>
           </w:tcPr>
           <w:p>
             <w:r>
@@ -948,7 +1942,20 @@
         </w:tc>
         <w:tc>
           <w:tcPr>
-            <w:tcW w:type="dxa" w:w="2736"/>
+            <w:tcW w:type="dxa" w:w="2160"/>
+          </w:tcPr>
+          <w:p>
+            <w:r>
+              <w:rPr>
+                <w:sz w:val="16"/>
+              </w:rPr>
+              <w:t>GP19</w:t>
+            </w:r>
+          </w:p>
+        </w:tc>
+        <w:tc>
+          <w:tcPr>
+            <w:tcW w:type="dxa" w:w="2160"/>
           </w:tcPr>
           <w:p>
             <w:r>
@@ -961,7 +1968,7 @@
         </w:tc>
         <w:tc>
           <w:tcPr>
-            <w:tcW w:type="dxa" w:w="2736"/>
+            <w:tcW w:type="dxa" w:w="2160"/>
           </w:tcPr>
           <w:p>
             <w:r>
@@ -976,7 +1983,7 @@
       <w:tr>
         <w:tc>
           <w:tcPr>
-            <w:tcW w:type="dxa" w:w="2736"/>
+            <w:tcW w:type="dxa" w:w="2160"/>
           </w:tcPr>
           <w:p>
             <w:r>
@@ -989,7 +1996,7 @@
         </w:tc>
         <w:tc>
           <w:tcPr>
-            <w:tcW w:type="dxa" w:w="2736"/>
+            <w:tcW w:type="dxa" w:w="2160"/>
           </w:tcPr>
           <w:p>
             <w:r>
@@ -1002,7 +2009,20 @@
         </w:tc>
         <w:tc>
           <w:tcPr>
-            <w:tcW w:type="dxa" w:w="2736"/>
+            <w:tcW w:type="dxa" w:w="2160"/>
+          </w:tcPr>
+          <w:p>
+            <w:r>
+              <w:rPr>
+                <w:sz w:val="16"/>
+              </w:rPr>
+              <w:t>GP18</w:t>
+            </w:r>
+          </w:p>
+        </w:tc>
+        <w:tc>
+          <w:tcPr>
+            <w:tcW w:type="dxa" w:w="2160"/>
           </w:tcPr>
           <w:p>
             <w:r>
@@ -1015,7 +2035,7 @@
         </w:tc>
         <w:tc>
           <w:tcPr>
-            <w:tcW w:type="dxa" w:w="2736"/>
+            <w:tcW w:type="dxa" w:w="2160"/>
           </w:tcPr>
           <w:p>
             <w:r>
@@ -1030,7 +2050,7 @@
       <w:tr>
         <w:tc>
           <w:tcPr>
-            <w:tcW w:type="dxa" w:w="2736"/>
+            <w:tcW w:type="dxa" w:w="2160"/>
           </w:tcPr>
           <w:p>
             <w:r>
@@ -1043,7 +2063,7 @@
         </w:tc>
         <w:tc>
           <w:tcPr>
-            <w:tcW w:type="dxa" w:w="2736"/>
+            <w:tcW w:type="dxa" w:w="2160"/>
           </w:tcPr>
           <w:p>
             <w:r>
@@ -1056,20 +2076,33 @@
         </w:tc>
         <w:tc>
           <w:tcPr>
-            <w:tcW w:type="dxa" w:w="2736"/>
+            <w:tcW w:type="dxa" w:w="2160"/>
           </w:tcPr>
           <w:p>
             <w:r>
               <w:rPr>
                 <w:sz w:val="16"/>
               </w:rPr>
-              <w:t>Switch</w:t>
+              <w:t>GP20</w:t>
             </w:r>
           </w:p>
         </w:tc>
         <w:tc>
           <w:tcPr>
-            <w:tcW w:type="dxa" w:w="2736"/>
+            <w:tcW w:type="dxa" w:w="2160"/>
+          </w:tcPr>
+          <w:p>
+            <w:r>
+              <w:rPr>
+                <w:sz w:val="16"/>
+              </w:rPr>
+              <w:t>Battery switch</w:t>
+            </w:r>
+          </w:p>
+        </w:tc>
+        <w:tc>
+          <w:tcPr>
+            <w:tcW w:type="dxa" w:w="2160"/>
           </w:tcPr>
           <w:p>
             <w:r>
@@ -1084,7 +2117,7 @@
       <w:tr>
         <w:tc>
           <w:tcPr>
-            <w:tcW w:type="dxa" w:w="2736"/>
+            <w:tcW w:type="dxa" w:w="2160"/>
           </w:tcPr>
           <w:p>
             <w:r>
@@ -1097,7 +2130,7 @@
         </w:tc>
         <w:tc>
           <w:tcPr>
-            <w:tcW w:type="dxa" w:w="2736"/>
+            <w:tcW w:type="dxa" w:w="2160"/>
           </w:tcPr>
           <w:p>
             <w:r>
@@ -1110,7 +2143,20 @@
         </w:tc>
         <w:tc>
           <w:tcPr>
-            <w:tcW w:type="dxa" w:w="2736"/>
+            <w:tcW w:type="dxa" w:w="2160"/>
+          </w:tcPr>
+          <w:p>
+            <w:r>
+              <w:rPr>
+                <w:sz w:val="16"/>
+              </w:rPr>
+              <w:t>GP21</w:t>
+            </w:r>
+          </w:p>
+        </w:tc>
+        <w:tc>
+          <w:tcPr>
+            <w:tcW w:type="dxa" w:w="2160"/>
           </w:tcPr>
           <w:p>
             <w:r>
@@ -1123,7 +2169,7 @@
         </w:tc>
         <w:tc>
           <w:tcPr>
-            <w:tcW w:type="dxa" w:w="2736"/>
+            <w:tcW w:type="dxa" w:w="2160"/>
           </w:tcPr>
           <w:p>
             <w:r>
@@ -1138,20 +2184,20 @@
       <w:tr>
         <w:tc>
           <w:tcPr>
-            <w:tcW w:type="dxa" w:w="2736"/>
+            <w:tcW w:type="dxa" w:w="2160"/>
           </w:tcPr>
           <w:p>
             <w:r>
               <w:rPr>
                 <w:sz w:val="16"/>
               </w:rPr>
-              <w:t>OUT7-8</w:t>
+              <w:t>OUT7–8</w:t>
             </w:r>
           </w:p>
         </w:tc>
         <w:tc>
           <w:tcPr>
-            <w:tcW w:type="dxa" w:w="2736"/>
+            <w:tcW w:type="dxa" w:w="2160"/>
           </w:tcPr>
           <w:p>
             <w:r>
@@ -1164,7 +2210,20 @@
         </w:tc>
         <w:tc>
           <w:tcPr>
-            <w:tcW w:type="dxa" w:w="2736"/>
+            <w:tcW w:type="dxa" w:w="2160"/>
+          </w:tcPr>
+          <w:p>
+            <w:r>
+              <w:rPr>
+                <w:sz w:val="16"/>
+              </w:rPr>
+              <w:t>GP16–17</w:t>
+            </w:r>
+          </w:p>
+        </w:tc>
+        <w:tc>
+          <w:tcPr>
+            <w:tcW w:type="dxa" w:w="2160"/>
           </w:tcPr>
           <w:p>
             <w:r>
@@ -1177,7 +2236,7 @@
         </w:tc>
         <w:tc>
           <w:tcPr>
-            <w:tcW w:type="dxa" w:w="2736"/>
+            <w:tcW w:type="dxa" w:w="2160"/>
           </w:tcPr>
           <w:p>
             <w:r>
@@ -1197,7 +2256,16 @@
           <w:b w:val="0"/>
           <w:sz w:val="16"/>
         </w:rPr>
-        <w:t>GND: common bus. RUN: OUT1-4 → 10kΩ → pin 30.</w:t>
+        <w:t>Opto jumpers = pull-up. RUN: OUT1–4 → shared node → 10 kΩ → pin 30.</w:t>
+      </w:r>
+    </w:p>
+    <w:p>
+      <w:r>
+        <w:rPr>
+          <w:b w:val="0"/>
+          <w:sz w:val="16"/>
+        </w:rPr>
+        <w:t>Each water float: one wire → House + (VIN+); other wire → Opto Ch3/4 IN+.</w:t>
       </w:r>
     </w:p>
     <w:p>
@@ -1205,7 +2273,7 @@
         <w:pStyle w:val="Heading2"/>
       </w:pPr>
       <w:r>
-        <w:t>PlusRoc + V50 USB-C charge</w:t>
+        <w:t>Switch vs key</w:t>
       </w:r>
     </w:p>
     <w:tbl>
@@ -1215,13 +2283,13 @@
         <w:tblLook w:firstColumn="1" w:firstRow="1" w:lastColumn="0" w:lastRow="0" w:noHBand="0" w:noVBand="1" w:val="04A0"/>
       </w:tblPr>
       <w:tblGrid>
-        <w:gridCol w:w="5472"/>
-        <w:gridCol w:w="5472"/>
+        <w:gridCol w:w="5400"/>
+        <w:gridCol w:w="5400"/>
       </w:tblGrid>
       <w:tr>
         <w:tc>
           <w:tcPr>
-            <w:tcW w:type="dxa" w:w="5472"/>
+            <w:tcW w:type="dxa" w:w="5400"/>
           </w:tcPr>
           <w:p>
             <w:r>
@@ -1229,13 +2297,13 @@
                 <w:b/>
                 <w:sz w:val="16"/>
               </w:rPr>
-              <w:t>PlusRoc / V50</w:t>
+              <w:t>Wire</w:t>
             </w:r>
           </w:p>
         </w:tc>
         <w:tc>
           <w:tcPr>
-            <w:tcW w:type="dxa" w:w="5472"/>
+            <w:tcW w:type="dxa" w:w="5400"/>
           </w:tcPr>
           <w:p>
             <w:r>
@@ -1243,7 +2311,7 @@
                 <w:b/>
                 <w:sz w:val="16"/>
               </w:rPr>
-              <w:t>Connect to</w:t>
+              <w:t>Meaning</w:t>
             </w:r>
           </w:p>
         </w:tc>
@@ -1251,27 +2319,27 @@
       <w:tr>
         <w:tc>
           <w:tcPr>
-            <w:tcW w:type="dxa" w:w="5472"/>
+            <w:tcW w:type="dxa" w:w="5400"/>
           </w:tcPr>
           <w:p>
             <w:r>
               <w:rPr>
                 <w:sz w:val="16"/>
               </w:rPr>
-              <w:t>IN+</w:t>
+              <w:t>Switch</w:t>
             </w:r>
           </w:p>
         </w:tc>
         <w:tc>
           <w:tcPr>
-            <w:tcW w:type="dxa" w:w="5472"/>
+            <w:tcW w:type="dxa" w:w="5400"/>
           </w:tcPr>
           <w:p>
             <w:r>
               <w:rPr>
                 <w:sz w:val="16"/>
               </w:rPr>
-              <w:t>Switch boat wire</w:t>
+              <w:t>Master battery ON — powers PlusRoc and boat</w:t>
             </w:r>
           </w:p>
         </w:tc>
@@ -1279,83 +2347,27 @@
       <w:tr>
         <w:tc>
           <w:tcPr>
-            <w:tcW w:type="dxa" w:w="5472"/>
+            <w:tcW w:type="dxa" w:w="5400"/>
           </w:tcPr>
           <w:p>
             <w:r>
               <w:rPr>
                 <w:sz w:val="16"/>
               </w:rPr>
-              <w:t>OUT+ 5V</w:t>
+              <w:t>Key</w:t>
             </w:r>
           </w:p>
         </w:tc>
         <w:tc>
           <w:tcPr>
-            <w:tcW w:type="dxa" w:w="5472"/>
+            <w:tcW w:type="dxa" w:w="5400"/>
           </w:tcPr>
           <w:p>
             <w:r>
               <w:rPr>
                 <w:sz w:val="16"/>
               </w:rPr>
-              <w:t>TPS IN2 + V50 USB-C charge IN (+)</w:t>
-            </w:r>
-          </w:p>
-        </w:tc>
-      </w:tr>
-      <w:tr>
-        <w:tc>
-          <w:tcPr>
-            <w:tcW w:type="dxa" w:w="5472"/>
-          </w:tcPr>
-          <w:p>
-            <w:r>
-              <w:rPr>
-                <w:sz w:val="16"/>
-              </w:rPr>
-              <w:t>Modem 5V</w:t>
-            </w:r>
-          </w:p>
-        </w:tc>
-        <w:tc>
-          <w:tcPr>
-            <w:tcW w:type="dxa" w:w="5472"/>
-          </w:tcPr>
-          <w:p>
-            <w:r>
-              <w:rPr>
-                <w:sz w:val="16"/>
-              </w:rPr>
-              <w:t>PlusRoc OUT+ and V50 USB-A #2 (+) each via diode</w:t>
-            </w:r>
-          </w:p>
-        </w:tc>
-      </w:tr>
-      <w:tr>
-        <w:tc>
-          <w:tcPr>
-            <w:tcW w:type="dxa" w:w="5472"/>
-          </w:tcPr>
-          <w:p>
-            <w:r>
-              <w:rPr>
-                <w:sz w:val="16"/>
-              </w:rPr>
-              <w:t>GND</w:t>
-            </w:r>
-          </w:p>
-        </w:tc>
-        <w:tc>
-          <w:tcPr>
-            <w:tcW w:type="dxa" w:w="5472"/>
-          </w:tcPr>
-          <w:p>
-            <w:r>
-              <w:rPr>
-                <w:sz w:val="16"/>
-              </w:rPr>
-              <w:t>Ground bus (all V50 −, PlusRoc IN−/OUT−)</w:t>
+              <w:t>Ignition ON (sense on pin 27); does not power PlusRoc</w:t>
             </w:r>
           </w:p>
         </w:tc>
@@ -1363,37 +2375,11 @@
     </w:tbl>
     <w:p/>
     <w:p>
-      <w:r>
-        <w:rPr>
-          <w:b w:val="0"/>
-          <w:sz w:val="16"/>
-        </w:rPr>
-        <w:t>V50 USB-C = charge IN only (separate from USB-A #1 Pico and #2 modem).</w:t>
-      </w:r>
-    </w:p>
-    <w:p>
       <w:pPr>
         <w:pStyle w:val="Heading2"/>
       </w:pPr>
       <w:r>
-        <w:t>Switch vs Key</w:t>
-      </w:r>
-    </w:p>
-    <w:p>
-      <w:r>
-        <w:rPr>
-          <w:b w:val="0"/>
-          <w:sz w:val="17"/>
-        </w:rPr>
-        <w:t>Switch = master battery ON (powers boat). Key = ignition ON even if engine not charging.</w:t>
-      </w:r>
-    </w:p>
-    <w:p>
-      <w:pPr>
-        <w:pStyle w:val="Heading2"/>
-      </w:pPr>
-      <w:r>
-        <w:t>Checklist</w:t>
+        <w:t>Field checklist</w:t>
       </w:r>
     </w:p>
     <w:tbl>
@@ -1403,8 +2389,8 @@
         <w:tblLook w:firstColumn="1" w:firstRow="1" w:lastColumn="0" w:lastRow="0" w:noHBand="0" w:noVBand="1" w:val="04A0"/>
       </w:tblPr>
       <w:tblGrid>
-        <w:gridCol w:w="5472"/>
-        <w:gridCol w:w="5472"/>
+        <w:gridCol w:w="5400"/>
+        <w:gridCol w:w="5400"/>
       </w:tblGrid>
       <w:tr>
         <w:tc>
@@ -1459,7 +2445,7 @@
               <w:rPr>
                 <w:sz w:val="16"/>
               </w:rPr>
-              <w:t>Modem 5V GND pins 11 12 14</w:t>
+              <w:t>Modem: 5 V, GND, pins 11, 12, 14; HAT jumpers set</w:t>
             </w:r>
           </w:p>
         </w:tc>
@@ -1487,7 +2473,7 @@
               <w:rPr>
                 <w:sz w:val="16"/>
               </w:rPr>
-              <w:t>Opto + RUN 10kΩ</w:t>
+              <w:t>Modem 5 V diode bus from PlusRoc + V50 USB-A #2</w:t>
             </w:r>
           </w:p>
         </w:tc>
@@ -1515,7 +2501,7 @@
               <w:rPr>
                 <w:sz w:val="16"/>
               </w:rPr>
-              <w:t>PlusRoc</w:t>
+              <w:t>PlusRoc: Switch IN+, OUT+ → TPS IN2, V50 USB-C, modem (via diode)</w:t>
             </w:r>
           </w:p>
         </w:tc>
@@ -1543,7 +2529,63 @@
               <w:rPr>
                 <w:sz w:val="16"/>
               </w:rPr>
-              <w:t>16 boat wires (page 2)</w:t>
+              <w:t>Opto outputs → pins 24–27, 29, 31 (+ spare 21–22)</w:t>
+            </w:r>
+          </w:p>
+        </w:tc>
+      </w:tr>
+      <w:tr>
+        <w:tc>
+          <w:tcPr>
+            <w:tcW w:type="dxa" w:w="360"/>
+          </w:tcPr>
+          <w:p>
+            <w:r>
+              <w:rPr>
+                <w:sz w:val="16"/>
+              </w:rPr>
+              <w:t>☐</w:t>
+            </w:r>
+          </w:p>
+        </w:tc>
+        <w:tc>
+          <w:tcPr>
+            <w:tcW w:type="dxa" w:w="8640"/>
+          </w:tcPr>
+          <w:p>
+            <w:r>
+              <w:rPr>
+                <w:sz w:val="16"/>
+              </w:rPr>
+              <w:t>RUN: bilge/float OUT1–4 → 10 kΩ → pin 30</w:t>
+            </w:r>
+          </w:p>
+        </w:tc>
+      </w:tr>
+      <w:tr>
+        <w:tc>
+          <w:tcPr>
+            <w:tcW w:type="dxa" w:w="360"/>
+          </w:tcPr>
+          <w:p>
+            <w:r>
+              <w:rPr>
+                <w:sz w:val="16"/>
+              </w:rPr>
+              <w:t>☐</w:t>
+            </w:r>
+          </w:p>
+        </w:tc>
+        <w:tc>
+          <w:tcPr>
+            <w:tcW w:type="dxa" w:w="8640"/>
+          </w:tcPr>
+          <w:p>
+            <w:r>
+              <w:rPr>
+                <w:sz w:val="16"/>
+              </w:rPr>
+              <w:t>16 boat harness wires (page 2)</w:t>
             </w:r>
           </w:p>
         </w:tc>
@@ -1560,7 +2602,7 @@
         <w:pStyle w:val="Heading1"/>
       </w:pPr>
       <w:r>
-        <w:t>SECTION 3 — Final pin map</w:t>
+        <w:t>SECTION 3 — Pin map (physical pin numbers)</w:t>
       </w:r>
     </w:p>
     <w:tbl>
@@ -1570,14 +2612,14 @@
         <w:tblLook w:firstColumn="1" w:firstRow="1" w:lastColumn="0" w:lastRow="0" w:noHBand="0" w:noVBand="1" w:val="04A0"/>
       </w:tblPr>
       <w:tblGrid>
-        <w:gridCol w:w="3648"/>
-        <w:gridCol w:w="3648"/>
-        <w:gridCol w:w="3648"/>
+        <w:gridCol w:w="3600"/>
+        <w:gridCol w:w="3600"/>
+        <w:gridCol w:w="3600"/>
       </w:tblGrid>
       <w:tr>
         <w:tc>
           <w:tcPr>
-            <w:tcW w:type="dxa" w:w="3648"/>
+            <w:tcW w:type="dxa" w:w="3600"/>
           </w:tcPr>
           <w:p>
             <w:r>
@@ -1591,7 +2633,7 @@
         </w:tc>
         <w:tc>
           <w:tcPr>
-            <w:tcW w:type="dxa" w:w="3648"/>
+            <w:tcW w:type="dxa" w:w="3600"/>
           </w:tcPr>
           <w:p>
             <w:r>
@@ -1605,7 +2647,7 @@
         </w:tc>
         <w:tc>
           <w:tcPr>
-            <w:tcW w:type="dxa" w:w="3648"/>
+            <w:tcW w:type="dxa" w:w="3600"/>
           </w:tcPr>
           <w:p>
             <w:r>
@@ -1621,20 +2663,20 @@
       <w:tr>
         <w:tc>
           <w:tcPr>
-            <w:tcW w:type="dxa" w:w="3648"/>
+            <w:tcW w:type="dxa" w:w="3600"/>
           </w:tcPr>
           <w:p>
             <w:r>
               <w:rPr>
                 <w:sz w:val="16"/>
               </w:rPr>
-              <w:t>1-7, 9, 15, 17-20, 39</w:t>
+              <w:t>1–7, 9, 15, 17–20, 39</w:t>
             </w:r>
           </w:p>
         </w:tc>
         <w:tc>
           <w:tcPr>
-            <w:tcW w:type="dxa" w:w="3648"/>
+            <w:tcW w:type="dxa" w:w="3600"/>
           </w:tcPr>
           <w:p>
             <w:r>
@@ -1647,14 +2689,14 @@
         </w:tc>
         <w:tc>
           <w:tcPr>
-            <w:tcW w:type="dxa" w:w="3648"/>
+            <w:tcW w:type="dxa" w:w="3600"/>
           </w:tcPr>
           <w:p>
             <w:r>
               <w:rPr>
                 <w:sz w:val="16"/>
               </w:rPr>
-              <w:t>I2C, STAT, VSNS, LEDs, VSYS</w:t>
+              <w:t>I2C, TPS STAT/VSNS, LEDs, VSYS</w:t>
             </w:r>
           </w:p>
         </w:tc>
@@ -1662,20 +2704,20 @@
       <w:tr>
         <w:tc>
           <w:tcPr>
-            <w:tcW w:type="dxa" w:w="3648"/>
+            <w:tcW w:type="dxa" w:w="3600"/>
           </w:tcPr>
           <w:p>
             <w:r>
               <w:rPr>
                 <w:sz w:val="16"/>
               </w:rPr>
-              <w:t>11-12, 14</w:t>
+              <w:t>11, 12, 14</w:t>
             </w:r>
           </w:p>
         </w:tc>
         <w:tc>
           <w:tcPr>
-            <w:tcW w:type="dxa" w:w="3648"/>
+            <w:tcW w:type="dxa" w:w="3600"/>
           </w:tcPr>
           <w:p>
             <w:r>
@@ -1688,14 +2730,14 @@
         </w:tc>
         <w:tc>
           <w:tcPr>
-            <w:tcW w:type="dxa" w:w="3648"/>
+            <w:tcW w:type="dxa" w:w="3600"/>
           </w:tcPr>
           <w:p>
             <w:r>
               <w:rPr>
                 <w:sz w:val="16"/>
               </w:rPr>
-              <w:t>Modem</w:t>
+              <w:t>Modem RXD, TXD, RST</w:t>
             </w:r>
           </w:p>
         </w:tc>
@@ -1703,61 +2745,20 @@
       <w:tr>
         <w:tc>
           <w:tcPr>
-            <w:tcW w:type="dxa" w:w="3648"/>
+            <w:tcW w:type="dxa" w:w="3600"/>
           </w:tcPr>
           <w:p>
             <w:r>
               <w:rPr>
                 <w:sz w:val="16"/>
               </w:rPr>
-              <w:t>21-22</w:t>
+              <w:t>24–27, 29, 31</w:t>
             </w:r>
           </w:p>
         </w:tc>
         <w:tc>
           <w:tcPr>
-            <w:tcW w:type="dxa" w:w="3648"/>
-          </w:tcPr>
-          <w:p>
-            <w:r>
-              <w:rPr>
-                <w:sz w:val="16"/>
-              </w:rPr>
-              <w:t>spare</w:t>
-            </w:r>
-          </w:p>
-        </w:tc>
-        <w:tc>
-          <w:tcPr>
-            <w:tcW w:type="dxa" w:w="3648"/>
-          </w:tcPr>
-          <w:p>
-            <w:r>
-              <w:rPr>
-                <w:sz w:val="16"/>
-              </w:rPr>
-              <w:t>Opto Ch7-8</w:t>
-            </w:r>
-          </w:p>
-        </w:tc>
-      </w:tr>
-      <w:tr>
-        <w:tc>
-          <w:tcPr>
-            <w:tcW w:type="dxa" w:w="3648"/>
-          </w:tcPr>
-          <w:p>
-            <w:r>
-              <w:rPr>
-                <w:sz w:val="16"/>
-              </w:rPr>
-              <w:t>24-27, 29, 31</w:t>
-            </w:r>
-          </w:p>
-        </w:tc>
-        <w:tc>
-          <w:tcPr>
-            <w:tcW w:type="dxa" w:w="3648"/>
+            <w:tcW w:type="dxa" w:w="3600"/>
           </w:tcPr>
           <w:p>
             <w:r>
@@ -1770,14 +2771,14 @@
         </w:tc>
         <w:tc>
           <w:tcPr>
-            <w:tcW w:type="dxa" w:w="3648"/>
+            <w:tcW w:type="dxa" w:w="3600"/>
           </w:tcPr>
           <w:p>
             <w:r>
               <w:rPr>
                 <w:sz w:val="16"/>
               </w:rPr>
-              <w:t>Opto OUT1-6</w:t>
+              <w:t>Opto OUT4–OUT1, switch, key</w:t>
             </w:r>
           </w:p>
         </w:tc>
@@ -1785,7 +2786,48 @@
       <w:tr>
         <w:tc>
           <w:tcPr>
-            <w:tcW w:type="dxa" w:w="3648"/>
+            <w:tcW w:type="dxa" w:w="3600"/>
+          </w:tcPr>
+          <w:p>
+            <w:r>
+              <w:rPr>
+                <w:sz w:val="16"/>
+              </w:rPr>
+              <w:t>21–22</w:t>
+            </w:r>
+          </w:p>
+        </w:tc>
+        <w:tc>
+          <w:tcPr>
+            <w:tcW w:type="dxa" w:w="3600"/>
+          </w:tcPr>
+          <w:p>
+            <w:r>
+              <w:rPr>
+                <w:sz w:val="16"/>
+              </w:rPr>
+              <w:t>Spare</w:t>
+            </w:r>
+          </w:p>
+        </w:tc>
+        <w:tc>
+          <w:tcPr>
+            <w:tcW w:type="dxa" w:w="3600"/>
+          </w:tcPr>
+          <w:p>
+            <w:r>
+              <w:rPr>
+                <w:sz w:val="16"/>
+              </w:rPr>
+              <w:t>Opto Ch7–8</w:t>
+            </w:r>
+          </w:p>
+        </w:tc>
+      </w:tr>
+      <w:tr>
+        <w:tc>
+          <w:tcPr>
+            <w:tcW w:type="dxa" w:w="3600"/>
           </w:tcPr>
           <w:p>
             <w:r>
@@ -1798,7 +2840,7 @@
         </w:tc>
         <w:tc>
           <w:tcPr>
-            <w:tcW w:type="dxa" w:w="3648"/>
+            <w:tcW w:type="dxa" w:w="3600"/>
           </w:tcPr>
           <w:p>
             <w:r>
@@ -1811,14 +2853,14 @@
         </w:tc>
         <w:tc>
           <w:tcPr>
-            <w:tcW w:type="dxa" w:w="3648"/>
+            <w:tcW w:type="dxa" w:w="3600"/>
           </w:tcPr>
           <w:p>
             <w:r>
               <w:rPr>
                 <w:sz w:val="16"/>
               </w:rPr>
-              <w:t>RUN 10k from OUT1-4</w:t>
+              <w:t>RUN ← 10 kΩ ← opto OUT1–4</w:t>
             </w:r>
           </w:p>
         </w:tc>
@@ -1830,7 +2872,7 @@
         <w:pStyle w:val="Heading1"/>
       </w:pPr>
       <w:r>
-        <w:t>SECTION 4 — 16 boat wires</w:t>
+        <w:t>SECTION 4 — 16 boat harness wires</w:t>
       </w:r>
     </w:p>
     <w:tbl>
@@ -1840,14 +2882,14 @@
         <w:tblLook w:firstColumn="1" w:firstRow="1" w:lastColumn="0" w:lastRow="0" w:noHBand="0" w:noVBand="1" w:val="04A0"/>
       </w:tblPr>
       <w:tblGrid>
-        <w:gridCol w:w="3648"/>
-        <w:gridCol w:w="3648"/>
-        <w:gridCol w:w="3648"/>
+        <w:gridCol w:w="3600"/>
+        <w:gridCol w:w="3600"/>
+        <w:gridCol w:w="3600"/>
       </w:tblGrid>
       <w:tr>
         <w:tc>
           <w:tcPr>
-            <w:tcW w:type="dxa" w:w="432"/>
+            <w:tcW w:type="dxa" w:w="504"/>
           </w:tcPr>
           <w:p>
             <w:r>
@@ -1861,7 +2903,7 @@
         </w:tc>
         <w:tc>
           <w:tcPr>
-            <w:tcW w:type="dxa" w:w="1440"/>
+            <w:tcW w:type="dxa" w:w="1512"/>
           </w:tcPr>
           <w:p>
             <w:r>
@@ -1875,7 +2917,7 @@
         </w:tc>
         <w:tc>
           <w:tcPr>
-            <w:tcW w:type="dxa" w:w="7056"/>
+            <w:tcW w:type="dxa" w:w="6912"/>
           </w:tcPr>
           <w:p>
             <w:r>
@@ -1891,7 +2933,7 @@
       <w:tr>
         <w:tc>
           <w:tcPr>
-            <w:tcW w:type="dxa" w:w="432"/>
+            <w:tcW w:type="dxa" w:w="504"/>
           </w:tcPr>
           <w:p>
             <w:r>
@@ -1904,7 +2946,7 @@
         </w:tc>
         <w:tc>
           <w:tcPr>
-            <w:tcW w:type="dxa" w:w="1440"/>
+            <w:tcW w:type="dxa" w:w="1512"/>
           </w:tcPr>
           <w:p>
             <w:r>
@@ -1917,7 +2959,7 @@
         </w:tc>
         <w:tc>
           <w:tcPr>
-            <w:tcW w:type="dxa" w:w="7056"/>
+            <w:tcW w:type="dxa" w:w="6912"/>
           </w:tcPr>
           <w:p>
             <w:r>
@@ -1932,7 +2974,7 @@
       <w:tr>
         <w:tc>
           <w:tcPr>
-            <w:tcW w:type="dxa" w:w="432"/>
+            <w:tcW w:type="dxa" w:w="504"/>
           </w:tcPr>
           <w:p>
             <w:r>
@@ -1945,7 +2987,7 @@
         </w:tc>
         <w:tc>
           <w:tcPr>
-            <w:tcW w:type="dxa" w:w="1440"/>
+            <w:tcW w:type="dxa" w:w="1512"/>
           </w:tcPr>
           <w:p>
             <w:r>
@@ -1958,7 +3000,7 @@
         </w:tc>
         <w:tc>
           <w:tcPr>
-            <w:tcW w:type="dxa" w:w="7056"/>
+            <w:tcW w:type="dxa" w:w="6912"/>
           </w:tcPr>
           <w:p>
             <w:r>
@@ -1973,7 +3015,7 @@
       <w:tr>
         <w:tc>
           <w:tcPr>
-            <w:tcW w:type="dxa" w:w="432"/>
+            <w:tcW w:type="dxa" w:w="504"/>
           </w:tcPr>
           <w:p>
             <w:r>
@@ -1986,7 +3028,7 @@
         </w:tc>
         <w:tc>
           <w:tcPr>
-            <w:tcW w:type="dxa" w:w="1440"/>
+            <w:tcW w:type="dxa" w:w="1512"/>
           </w:tcPr>
           <w:p>
             <w:r>
@@ -1999,14 +3041,14 @@
         </w:tc>
         <w:tc>
           <w:tcPr>
-            <w:tcW w:type="dxa" w:w="7056"/>
+            <w:tcW w:type="dxa" w:w="6912"/>
           </w:tcPr>
           <w:p>
             <w:r>
               <w:rPr>
                 <w:sz w:val="16"/>
               </w:rPr>
-              <w:t>Middle INA260 VIN+ + both float 12V wires</w:t>
+              <w:t>Middle INA260 VIN+ + tee both float 12 V</w:t>
             </w:r>
           </w:p>
         </w:tc>
@@ -2014,7 +3056,7 @@
       <w:tr>
         <w:tc>
           <w:tcPr>
-            <w:tcW w:type="dxa" w:w="432"/>
+            <w:tcW w:type="dxa" w:w="504"/>
           </w:tcPr>
           <w:p>
             <w:r>
@@ -2027,7 +3069,7 @@
         </w:tc>
         <w:tc>
           <w:tcPr>
-            <w:tcW w:type="dxa" w:w="1440"/>
+            <w:tcW w:type="dxa" w:w="1512"/>
           </w:tcPr>
           <w:p>
             <w:r>
@@ -2040,7 +3082,7 @@
         </w:tc>
         <w:tc>
           <w:tcPr>
-            <w:tcW w:type="dxa" w:w="7056"/>
+            <w:tcW w:type="dxa" w:w="6912"/>
           </w:tcPr>
           <w:p>
             <w:r>
@@ -2055,7 +3097,7 @@
       <w:tr>
         <w:tc>
           <w:tcPr>
-            <w:tcW w:type="dxa" w:w="432"/>
+            <w:tcW w:type="dxa" w:w="504"/>
           </w:tcPr>
           <w:p>
             <w:r>
@@ -2068,20 +3110,20 @@
         </w:tc>
         <w:tc>
           <w:tcPr>
-            <w:tcW w:type="dxa" w:w="1440"/>
+            <w:tcW w:type="dxa" w:w="1512"/>
           </w:tcPr>
           <w:p>
             <w:r>
               <w:rPr>
                 <w:sz w:val="16"/>
               </w:rPr>
-              <w:t>Mid bildge</w:t>
+              <w:t>Mid bilge</w:t>
             </w:r>
           </w:p>
         </w:tc>
         <w:tc>
           <w:tcPr>
-            <w:tcW w:type="dxa" w:w="7056"/>
+            <w:tcW w:type="dxa" w:w="6912"/>
           </w:tcPr>
           <w:p>
             <w:r>
@@ -2096,7 +3138,7 @@
       <w:tr>
         <w:tc>
           <w:tcPr>
-            <w:tcW w:type="dxa" w:w="432"/>
+            <w:tcW w:type="dxa" w:w="504"/>
           </w:tcPr>
           <w:p>
             <w:r>
@@ -2109,20 +3151,20 @@
         </w:tc>
         <w:tc>
           <w:tcPr>
-            <w:tcW w:type="dxa" w:w="1440"/>
+            <w:tcW w:type="dxa" w:w="1512"/>
           </w:tcPr>
           <w:p>
             <w:r>
               <w:rPr>
                 <w:sz w:val="16"/>
               </w:rPr>
-              <w:t>Aft bilgde</w:t>
+              <w:t>Aft bilge</w:t>
             </w:r>
           </w:p>
         </w:tc>
         <w:tc>
           <w:tcPr>
-            <w:tcW w:type="dxa" w:w="7056"/>
+            <w:tcW w:type="dxa" w:w="6912"/>
           </w:tcPr>
           <w:p>
             <w:r>
@@ -2137,7 +3179,7 @@
       <w:tr>
         <w:tc>
           <w:tcPr>
-            <w:tcW w:type="dxa" w:w="432"/>
+            <w:tcW w:type="dxa" w:w="504"/>
           </w:tcPr>
           <w:p>
             <w:r>
@@ -2150,7 +3192,7 @@
         </w:tc>
         <w:tc>
           <w:tcPr>
-            <w:tcW w:type="dxa" w:w="1440"/>
+            <w:tcW w:type="dxa" w:w="1512"/>
           </w:tcPr>
           <w:p>
             <w:r>
@@ -2163,7 +3205,7 @@
         </w:tc>
         <w:tc>
           <w:tcPr>
-            <w:tcW w:type="dxa" w:w="7056"/>
+            <w:tcW w:type="dxa" w:w="6912"/>
           </w:tcPr>
           <w:p>
             <w:r>
@@ -2178,7 +3220,7 @@
       <w:tr>
         <w:tc>
           <w:tcPr>
-            <w:tcW w:type="dxa" w:w="432"/>
+            <w:tcW w:type="dxa" w:w="504"/>
           </w:tcPr>
           <w:p>
             <w:r>
@@ -2191,7 +3233,7 @@
         </w:tc>
         <w:tc>
           <w:tcPr>
-            <w:tcW w:type="dxa" w:w="1440"/>
+            <w:tcW w:type="dxa" w:w="1512"/>
           </w:tcPr>
           <w:p>
             <w:r>
@@ -2204,7 +3246,7 @@
         </w:tc>
         <w:tc>
           <w:tcPr>
-            <w:tcW w:type="dxa" w:w="7056"/>
+            <w:tcW w:type="dxa" w:w="6912"/>
           </w:tcPr>
           <w:p>
             <w:r>
@@ -2219,7 +3261,7 @@
       <w:tr>
         <w:tc>
           <w:tcPr>
-            <w:tcW w:type="dxa" w:w="432"/>
+            <w:tcW w:type="dxa" w:w="504"/>
           </w:tcPr>
           <w:p>
             <w:r>
@@ -2232,7 +3274,7 @@
         </w:tc>
         <w:tc>
           <w:tcPr>
-            <w:tcW w:type="dxa" w:w="1440"/>
+            <w:tcW w:type="dxa" w:w="1512"/>
           </w:tcPr>
           <w:p>
             <w:r>
@@ -2245,14 +3287,14 @@
         </w:tc>
         <w:tc>
           <w:tcPr>
-            <w:tcW w:type="dxa" w:w="7056"/>
+            <w:tcW w:type="dxa" w:w="6912"/>
           </w:tcPr>
           <w:p>
             <w:r>
               <w:rPr>
                 <w:sz w:val="16"/>
               </w:rPr>
-              <w:t>House + (same as wire 3)</w:t>
+              <w:t>House + (wire 3)</w:t>
             </w:r>
           </w:p>
         </w:tc>
@@ -2260,7 +3302,7 @@
       <w:tr>
         <w:tc>
           <w:tcPr>
-            <w:tcW w:type="dxa" w:w="432"/>
+            <w:tcW w:type="dxa" w:w="504"/>
           </w:tcPr>
           <w:p>
             <w:r>
@@ -2273,7 +3315,7 @@
         </w:tc>
         <w:tc>
           <w:tcPr>
-            <w:tcW w:type="dxa" w:w="1440"/>
+            <w:tcW w:type="dxa" w:w="1512"/>
           </w:tcPr>
           <w:p>
             <w:r>
@@ -2286,7 +3328,7 @@
         </w:tc>
         <w:tc>
           <w:tcPr>
-            <w:tcW w:type="dxa" w:w="7056"/>
+            <w:tcW w:type="dxa" w:w="6912"/>
           </w:tcPr>
           <w:p>
             <w:r>
@@ -2301,7 +3343,7 @@
       <w:tr>
         <w:tc>
           <w:tcPr>
-            <w:tcW w:type="dxa" w:w="432"/>
+            <w:tcW w:type="dxa" w:w="504"/>
           </w:tcPr>
           <w:p>
             <w:r>
@@ -2314,20 +3356,20 @@
         </w:tc>
         <w:tc>
           <w:tcPr>
-            <w:tcW w:type="dxa" w:w="1440"/>
+            <w:tcW w:type="dxa" w:w="1512"/>
           </w:tcPr>
           <w:p>
             <w:r>
               <w:rPr>
                 <w:sz w:val="16"/>
               </w:rPr>
-              <w:t>Solar engin</w:t>
+              <w:t>Solar engine</w:t>
             </w:r>
           </w:p>
         </w:tc>
         <w:tc>
           <w:tcPr>
-            <w:tcW w:type="dxa" w:w="7056"/>
+            <w:tcW w:type="dxa" w:w="6912"/>
           </w:tcPr>
           <w:p>
             <w:r>
@@ -2342,7 +3384,7 @@
       <w:tr>
         <w:tc>
           <w:tcPr>
-            <w:tcW w:type="dxa" w:w="432"/>
+            <w:tcW w:type="dxa" w:w="504"/>
           </w:tcPr>
           <w:p>
             <w:r>
@@ -2355,20 +3397,20 @@
         </w:tc>
         <w:tc>
           <w:tcPr>
-            <w:tcW w:type="dxa" w:w="1440"/>
+            <w:tcW w:type="dxa" w:w="1512"/>
           </w:tcPr>
           <w:p>
             <w:r>
               <w:rPr>
                 <w:sz w:val="16"/>
               </w:rPr>
-              <w:t>Solar engin</w:t>
+              <w:t>Solar engine</w:t>
             </w:r>
           </w:p>
         </w:tc>
         <w:tc>
           <w:tcPr>
-            <w:tcW w:type="dxa" w:w="7056"/>
+            <w:tcW w:type="dxa" w:w="6912"/>
           </w:tcPr>
           <w:p>
             <w:r>
@@ -2383,7 +3425,7 @@
       <w:tr>
         <w:tc>
           <w:tcPr>
-            <w:tcW w:type="dxa" w:w="432"/>
+            <w:tcW w:type="dxa" w:w="504"/>
           </w:tcPr>
           <w:p>
             <w:r>
@@ -2396,20 +3438,20 @@
         </w:tc>
         <w:tc>
           <w:tcPr>
-            <w:tcW w:type="dxa" w:w="1440"/>
+            <w:tcW w:type="dxa" w:w="1512"/>
           </w:tcPr>
           <w:p>
             <w:r>
               <w:rPr>
                 <w:sz w:val="16"/>
               </w:rPr>
-              <w:t>Solar hous</w:t>
+              <w:t>Solar house</w:t>
             </w:r>
           </w:p>
         </w:tc>
         <w:tc>
           <w:tcPr>
-            <w:tcW w:type="dxa" w:w="7056"/>
+            <w:tcW w:type="dxa" w:w="6912"/>
           </w:tcPr>
           <w:p>
             <w:r>
@@ -2424,7 +3466,7 @@
       <w:tr>
         <w:tc>
           <w:tcPr>
-            <w:tcW w:type="dxa" w:w="432"/>
+            <w:tcW w:type="dxa" w:w="504"/>
           </w:tcPr>
           <w:p>
             <w:r>
@@ -2437,20 +3479,20 @@
         </w:tc>
         <w:tc>
           <w:tcPr>
-            <w:tcW w:type="dxa" w:w="1440"/>
+            <w:tcW w:type="dxa" w:w="1512"/>
           </w:tcPr>
           <w:p>
             <w:r>
               <w:rPr>
                 <w:sz w:val="16"/>
               </w:rPr>
-              <w:t>Solar hous</w:t>
+              <w:t>Solar house</w:t>
             </w:r>
           </w:p>
         </w:tc>
         <w:tc>
           <w:tcPr>
-            <w:tcW w:type="dxa" w:w="7056"/>
+            <w:tcW w:type="dxa" w:w="6912"/>
           </w:tcPr>
           <w:p>
             <w:r>
@@ -2465,7 +3507,7 @@
       <w:tr>
         <w:tc>
           <w:tcPr>
-            <w:tcW w:type="dxa" w:w="432"/>
+            <w:tcW w:type="dxa" w:w="504"/>
           </w:tcPr>
           <w:p>
             <w:r>
@@ -2478,7 +3520,7 @@
         </w:tc>
         <w:tc>
           <w:tcPr>
-            <w:tcW w:type="dxa" w:w="1440"/>
+            <w:tcW w:type="dxa" w:w="1512"/>
           </w:tcPr>
           <w:p>
             <w:r>
@@ -2491,14 +3533,14 @@
         </w:tc>
         <w:tc>
           <w:tcPr>
-            <w:tcW w:type="dxa" w:w="7056"/>
+            <w:tcW w:type="dxa" w:w="6912"/>
           </w:tcPr>
           <w:p>
             <w:r>
               <w:rPr>
                 <w:sz w:val="16"/>
               </w:rPr>
-              <w:t>House + (same as wire 3)</w:t>
+              <w:t>House + (wire 3)</w:t>
             </w:r>
           </w:p>
         </w:tc>
@@ -2506,7 +3548,7 @@
       <w:tr>
         <w:tc>
           <w:tcPr>
-            <w:tcW w:type="dxa" w:w="432"/>
+            <w:tcW w:type="dxa" w:w="504"/>
           </w:tcPr>
           <w:p>
             <w:r>
@@ -2519,7 +3561,7 @@
         </w:tc>
         <w:tc>
           <w:tcPr>
-            <w:tcW w:type="dxa" w:w="1440"/>
+            <w:tcW w:type="dxa" w:w="1512"/>
           </w:tcPr>
           <w:p>
             <w:r>
@@ -2532,7 +3574,7 @@
         </w:tc>
         <w:tc>
           <w:tcPr>
-            <w:tcW w:type="dxa" w:w="7056"/>
+            <w:tcW w:type="dxa" w:w="6912"/>
           </w:tcPr>
           <w:p>
             <w:r>
@@ -2546,9 +3588,329 @@
       </w:tr>
     </w:tbl>
     <w:p/>
+    <w:p>
+      <w:pPr>
+        <w:pStyle w:val="Heading1"/>
+      </w:pPr>
+      <w:r>
+        <w:t>Firmware GPIO quick reference (config.py)</w:t>
+      </w:r>
+    </w:p>
+    <w:tbl>
+      <w:tblPr>
+        <w:tblStyle w:val="TableGrid"/>
+        <w:tblW w:type="auto" w:w="0"/>
+        <w:tblLook w:firstColumn="1" w:firstRow="1" w:lastColumn="0" w:lastRow="0" w:noHBand="0" w:noVBand="1" w:val="04A0"/>
+      </w:tblPr>
+      <w:tblGrid>
+        <w:gridCol w:w="3600"/>
+        <w:gridCol w:w="3600"/>
+        <w:gridCol w:w="3600"/>
+      </w:tblGrid>
+      <w:tr>
+        <w:tc>
+          <w:tcPr>
+            <w:tcW w:type="dxa" w:w="3600"/>
+          </w:tcPr>
+          <w:p>
+            <w:r>
+              <w:rPr>
+                <w:b/>
+                <w:sz w:val="16"/>
+              </w:rPr>
+              <w:t>Function</w:t>
+            </w:r>
+          </w:p>
+        </w:tc>
+        <w:tc>
+          <w:tcPr>
+            <w:tcW w:type="dxa" w:w="3600"/>
+          </w:tcPr>
+          <w:p>
+            <w:r>
+              <w:rPr>
+                <w:b/>
+                <w:sz w:val="16"/>
+              </w:rPr>
+              <w:t>GPIO</w:t>
+            </w:r>
+          </w:p>
+        </w:tc>
+        <w:tc>
+          <w:tcPr>
+            <w:tcW w:type="dxa" w:w="3600"/>
+          </w:tcPr>
+          <w:p>
+            <w:r>
+              <w:rPr>
+                <w:b/>
+                <w:sz w:val="16"/>
+              </w:rPr>
+              <w:t>Physical pin</w:t>
+            </w:r>
+          </w:p>
+        </w:tc>
+      </w:tr>
+      <w:tr>
+        <w:tc>
+          <w:tcPr>
+            <w:tcW w:type="dxa" w:w="3600"/>
+          </w:tcPr>
+          <w:p>
+            <w:r>
+              <w:rPr>
+                <w:sz w:val="16"/>
+              </w:rPr>
+              <w:t>UART TX / RX</w:t>
+            </w:r>
+          </w:p>
+        </w:tc>
+        <w:tc>
+          <w:tcPr>
+            <w:tcW w:type="dxa" w:w="3600"/>
+          </w:tcPr>
+          <w:p>
+            <w:r>
+              <w:rPr>
+                <w:sz w:val="16"/>
+              </w:rPr>
+              <w:t>8 / 9</w:t>
+            </w:r>
+          </w:p>
+        </w:tc>
+        <w:tc>
+          <w:tcPr>
+            <w:tcW w:type="dxa" w:w="3600"/>
+          </w:tcPr>
+          <w:p>
+            <w:r>
+              <w:rPr>
+                <w:sz w:val="16"/>
+              </w:rPr>
+              <w:t>11 / 12</w:t>
+            </w:r>
+          </w:p>
+        </w:tc>
+      </w:tr>
+      <w:tr>
+        <w:tc>
+          <w:tcPr>
+            <w:tcW w:type="dxa" w:w="3600"/>
+          </w:tcPr>
+          <w:p>
+            <w:r>
+              <w:rPr>
+                <w:sz w:val="16"/>
+              </w:rPr>
+              <w:t>Modem RST</w:t>
+            </w:r>
+          </w:p>
+        </w:tc>
+        <w:tc>
+          <w:tcPr>
+            <w:tcW w:type="dxa" w:w="3600"/>
+          </w:tcPr>
+          <w:p>
+            <w:r>
+              <w:rPr>
+                <w:sz w:val="16"/>
+              </w:rPr>
+              <w:t>10</w:t>
+            </w:r>
+          </w:p>
+        </w:tc>
+        <w:tc>
+          <w:tcPr>
+            <w:tcW w:type="dxa" w:w="3600"/>
+          </w:tcPr>
+          <w:p>
+            <w:r>
+              <w:rPr>
+                <w:sz w:val="16"/>
+              </w:rPr>
+              <w:t>14</w:t>
+            </w:r>
+          </w:p>
+        </w:tc>
+      </w:tr>
+      <w:tr>
+        <w:tc>
+          <w:tcPr>
+            <w:tcW w:type="dxa" w:w="3600"/>
+          </w:tcPr>
+          <w:p>
+            <w:r>
+              <w:rPr>
+                <w:sz w:val="16"/>
+              </w:rPr>
+              <w:t>TPS STAT / VSNS</w:t>
+            </w:r>
+          </w:p>
+        </w:tc>
+        <w:tc>
+          <w:tcPr>
+            <w:tcW w:type="dxa" w:w="3600"/>
+          </w:tcPr>
+          <w:p>
+            <w:r>
+              <w:rPr>
+                <w:sz w:val="16"/>
+              </w:rPr>
+              <w:t>6 / 11</w:t>
+            </w:r>
+          </w:p>
+        </w:tc>
+        <w:tc>
+          <w:tcPr>
+            <w:tcW w:type="dxa" w:w="3600"/>
+          </w:tcPr>
+          <w:p>
+            <w:r>
+              <w:rPr>
+                <w:sz w:val="16"/>
+              </w:rPr>
+              <w:t>9 / 15</w:t>
+            </w:r>
+          </w:p>
+        </w:tc>
+      </w:tr>
+      <w:tr>
+        <w:tc>
+          <w:tcPr>
+            <w:tcW w:type="dxa" w:w="3600"/>
+          </w:tcPr>
+          <w:p>
+            <w:r>
+              <w:rPr>
+                <w:sz w:val="16"/>
+              </w:rPr>
+              <w:t>Bilge mid / aft</w:t>
+            </w:r>
+          </w:p>
+        </w:tc>
+        <w:tc>
+          <w:tcPr>
+            <w:tcW w:type="dxa" w:w="3600"/>
+          </w:tcPr>
+          <w:p>
+            <w:r>
+              <w:rPr>
+                <w:sz w:val="16"/>
+              </w:rPr>
+              <w:t>26 / 22</w:t>
+            </w:r>
+          </w:p>
+        </w:tc>
+        <w:tc>
+          <w:tcPr>
+            <w:tcW w:type="dxa" w:w="3600"/>
+          </w:tcPr>
+          <w:p>
+            <w:r>
+              <w:rPr>
+                <w:sz w:val="16"/>
+              </w:rPr>
+              <w:t>31 / 29</w:t>
+            </w:r>
+          </w:p>
+        </w:tc>
+      </w:tr>
+      <w:tr>
+        <w:tc>
+          <w:tcPr>
+            <w:tcW w:type="dxa" w:w="3600"/>
+          </w:tcPr>
+          <w:p>
+            <w:r>
+              <w:rPr>
+                <w:sz w:val="16"/>
+              </w:rPr>
+              <w:t>Float mid / aft</w:t>
+            </w:r>
+          </w:p>
+        </w:tc>
+        <w:tc>
+          <w:tcPr>
+            <w:tcW w:type="dxa" w:w="3600"/>
+          </w:tcPr>
+          <w:p>
+            <w:r>
+              <w:rPr>
+                <w:sz w:val="16"/>
+              </w:rPr>
+              <w:t>19 / 18</w:t>
+            </w:r>
+          </w:p>
+        </w:tc>
+        <w:tc>
+          <w:tcPr>
+            <w:tcW w:type="dxa" w:w="3600"/>
+          </w:tcPr>
+          <w:p>
+            <w:r>
+              <w:rPr>
+                <w:sz w:val="16"/>
+              </w:rPr>
+              <w:t>25 / 24</w:t>
+            </w:r>
+          </w:p>
+        </w:tc>
+      </w:tr>
+      <w:tr>
+        <w:tc>
+          <w:tcPr>
+            <w:tcW w:type="dxa" w:w="3600"/>
+          </w:tcPr>
+          <w:p>
+            <w:r>
+              <w:rPr>
+                <w:sz w:val="16"/>
+              </w:rPr>
+              <w:t>Switch / Key</w:t>
+            </w:r>
+          </w:p>
+        </w:tc>
+        <w:tc>
+          <w:tcPr>
+            <w:tcW w:type="dxa" w:w="3600"/>
+          </w:tcPr>
+          <w:p>
+            <w:r>
+              <w:rPr>
+                <w:sz w:val="16"/>
+              </w:rPr>
+              <w:t>20 / 21</w:t>
+            </w:r>
+          </w:p>
+        </w:tc>
+        <w:tc>
+          <w:tcPr>
+            <w:tcW w:type="dxa" w:w="3600"/>
+          </w:tcPr>
+          <w:p>
+            <w:r>
+              <w:rPr>
+                <w:sz w:val="16"/>
+              </w:rPr>
+              <w:t>26 / 27</w:t>
+            </w:r>
+          </w:p>
+        </w:tc>
+      </w:tr>
+    </w:tbl>
+    <w:p/>
+    <w:p>
+      <w:r>
+        <w:rPr>
+          <w:b w:val="0"/>
+          <w:sz w:val="14"/>
+        </w:rPr>
+        <w:t>Source: boat_monitor/WIRING_CHEAT_SHEET.md · Regenerate: python3 boat_monitor/build_cheat_sheet_docx.py</w:t>
+      </w:r>
+    </w:p>
     <w:sectPr>
       <w:pgSz w:w="12240" w:h="15840"/>
-      <w:pgMar w:top="576" w:right="648" w:bottom="576" w:left="648" w:header="720" w:footer="720" w:gutter="0"/>
+      <w:pgMar w:top="648" w:right="720" w:bottom="648" w:left="720" w:header="720" w:footer="720" w:gutter="0"/>
       <w:cols w:space="720"/>
       <w:docGrid w:linePitch="360"/>
     </w:sectPr>

</xml_diff>